<commit_message>
Dien day du cot Hoat dong cua HS cho 6 bai THCS - bo key buoc1 sang buoc1_gv/buoc1_hs
</commit_message>
<xml_diff>
--- a/Hệ thống mẫu văn bản/Nguyên đã làm/Lịch báo giảng/Lịch báo giảng - Tuần 01.docx
+++ b/Hệ thống mẫu văn bản/Nguyên đã làm/Lịch báo giảng/Lịch báo giảng - Tuần 01.docx
@@ -5594,11 +5594,11 @@
         <w:tblLook w:val="04A0" w:firstRow="1" w:lastRow="0" w:firstColumn="1" w:lastColumn="0" w:noHBand="0" w:noVBand="1"/>
       </w:tblPr>
       <w:tblGrid>
-        <w:gridCol w:w="1237"/>
-        <w:gridCol w:w="846"/>
-        <w:gridCol w:w="987"/>
-        <w:gridCol w:w="1144"/>
+        <w:gridCol w:w="1096"/>
+        <w:gridCol w:w="850"/>
         <w:gridCol w:w="709"/>
+        <w:gridCol w:w="1276"/>
+        <w:gridCol w:w="992"/>
         <w:gridCol w:w="3260"/>
         <w:gridCol w:w="1967"/>
       </w:tblGrid>
@@ -5608,7 +5608,7 @@
         </w:trPr>
         <w:tc>
           <w:tcPr>
-            <w:tcW w:w="1237" w:type="dxa"/>
+            <w:tcW w:w="1096" w:type="dxa"/>
             <w:tcBorders>
               <w:top w:val="single" w:sz="4" w:space="0" w:color="000000"/>
               <w:left w:val="single" w:sz="4" w:space="0" w:color="000000"/>
@@ -5660,7 +5660,7 @@
         </w:tc>
         <w:tc>
           <w:tcPr>
-            <w:tcW w:w="846" w:type="dxa"/>
+            <w:tcW w:w="850" w:type="dxa"/>
             <w:tcBorders>
               <w:top w:val="single" w:sz="4" w:space="0" w:color="000000"/>
               <w:left w:val="single" w:sz="4" w:space="0" w:color="000000"/>
@@ -5692,7 +5692,7 @@
         </w:tc>
         <w:tc>
           <w:tcPr>
-            <w:tcW w:w="987" w:type="dxa"/>
+            <w:tcW w:w="709" w:type="dxa"/>
             <w:tcBorders>
               <w:top w:val="single" w:sz="4" w:space="0" w:color="000000"/>
               <w:left w:val="single" w:sz="4" w:space="0" w:color="000000"/>
@@ -5724,7 +5724,7 @@
         </w:tc>
         <w:tc>
           <w:tcPr>
-            <w:tcW w:w="1144" w:type="dxa"/>
+            <w:tcW w:w="1276" w:type="dxa"/>
             <w:tcBorders>
               <w:top w:val="single" w:sz="4" w:space="0" w:color="000000"/>
               <w:left w:val="single" w:sz="4" w:space="0" w:color="000000"/>
@@ -5756,7 +5756,7 @@
         </w:tc>
         <w:tc>
           <w:tcPr>
-            <w:tcW w:w="709" w:type="dxa"/>
+            <w:tcW w:w="992" w:type="dxa"/>
             <w:tcBorders>
               <w:top w:val="single" w:sz="4" w:space="0" w:color="000000"/>
               <w:left w:val="single" w:sz="4" w:space="0" w:color="000000"/>
@@ -5857,7 +5857,7 @@
         </w:trPr>
         <w:tc>
           <w:tcPr>
-            <w:tcW w:w="1237" w:type="dxa"/>
+            <w:tcW w:w="1096" w:type="dxa"/>
             <w:vMerge w:val="restart"/>
             <w:tcBorders>
               <w:top w:val="single" w:sz="4" w:space="0" w:color="000000"/>
@@ -5886,7 +5886,7 @@
         </w:tc>
         <w:tc>
           <w:tcPr>
-            <w:tcW w:w="846" w:type="dxa"/>
+            <w:tcW w:w="850" w:type="dxa"/>
             <w:tcBorders>
               <w:top w:val="single" w:sz="4" w:space="0" w:color="000000"/>
               <w:left w:val="single" w:sz="4" w:space="0" w:color="000000"/>
@@ -5915,49 +5915,49 @@
         </w:tc>
         <w:tc>
           <w:tcPr>
-            <w:tcW w:w="987" w:type="dxa"/>
-            <w:tcBorders>
-              <w:top w:val="single" w:sz="4" w:space="0" w:color="000000"/>
-              <w:left w:val="single" w:sz="4" w:space="0" w:color="000000"/>
-              <w:bottom w:val="single" w:sz="4" w:space="0" w:color="000000"/>
-              <w:right w:val="single" w:sz="4" w:space="0" w:color="000000"/>
-            </w:tcBorders>
-            <w:vAlign w:val="center"/>
-          </w:tcPr>
-          <w:p>
-            <w:pPr>
-              <w:rPr>
-                <w:rFonts w:ascii="Times New Roman" w:hAnsi="Times New Roman" w:cs="Times New Roman"/>
-                <w:sz w:val="26"/>
-                <w:szCs w:val="26"/>
-              </w:rPr>
-            </w:pPr>
-          </w:p>
-        </w:tc>
-        <w:tc>
-          <w:tcPr>
-            <w:tcW w:w="1144" w:type="dxa"/>
-            <w:tcBorders>
-              <w:top w:val="single" w:sz="4" w:space="0" w:color="000000"/>
-              <w:left w:val="single" w:sz="4" w:space="0" w:color="000000"/>
-              <w:bottom w:val="single" w:sz="4" w:space="0" w:color="000000"/>
-              <w:right w:val="single" w:sz="4" w:space="0" w:color="000000"/>
-            </w:tcBorders>
-            <w:vAlign w:val="center"/>
-          </w:tcPr>
-          <w:p>
-            <w:pPr>
-              <w:rPr>
-                <w:rFonts w:ascii="Times New Roman" w:hAnsi="Times New Roman" w:cs="Times New Roman"/>
-                <w:sz w:val="26"/>
-                <w:szCs w:val="26"/>
-              </w:rPr>
-            </w:pPr>
-          </w:p>
-        </w:tc>
-        <w:tc>
-          <w:tcPr>
             <w:tcW w:w="709" w:type="dxa"/>
+            <w:tcBorders>
+              <w:top w:val="single" w:sz="4" w:space="0" w:color="000000"/>
+              <w:left w:val="single" w:sz="4" w:space="0" w:color="000000"/>
+              <w:bottom w:val="single" w:sz="4" w:space="0" w:color="000000"/>
+              <w:right w:val="single" w:sz="4" w:space="0" w:color="000000"/>
+            </w:tcBorders>
+            <w:vAlign w:val="center"/>
+          </w:tcPr>
+          <w:p>
+            <w:pPr>
+              <w:rPr>
+                <w:rFonts w:ascii="Times New Roman" w:hAnsi="Times New Roman" w:cs="Times New Roman"/>
+                <w:sz w:val="26"/>
+                <w:szCs w:val="26"/>
+              </w:rPr>
+            </w:pPr>
+          </w:p>
+        </w:tc>
+        <w:tc>
+          <w:tcPr>
+            <w:tcW w:w="1276" w:type="dxa"/>
+            <w:tcBorders>
+              <w:top w:val="single" w:sz="4" w:space="0" w:color="000000"/>
+              <w:left w:val="single" w:sz="4" w:space="0" w:color="000000"/>
+              <w:bottom w:val="single" w:sz="4" w:space="0" w:color="000000"/>
+              <w:right w:val="single" w:sz="4" w:space="0" w:color="000000"/>
+            </w:tcBorders>
+            <w:vAlign w:val="center"/>
+          </w:tcPr>
+          <w:p>
+            <w:pPr>
+              <w:rPr>
+                <w:rFonts w:ascii="Times New Roman" w:hAnsi="Times New Roman" w:cs="Times New Roman"/>
+                <w:sz w:val="26"/>
+                <w:szCs w:val="26"/>
+              </w:rPr>
+            </w:pPr>
+          </w:p>
+        </w:tc>
+        <w:tc>
+          <w:tcPr>
+            <w:tcW w:w="992" w:type="dxa"/>
             <w:tcBorders>
               <w:top w:val="single" w:sz="4" w:space="0" w:color="000000"/>
               <w:left w:val="single" w:sz="4" w:space="0" w:color="000000"/>
@@ -6025,7 +6025,7 @@
         </w:trPr>
         <w:tc>
           <w:tcPr>
-            <w:tcW w:w="1237" w:type="dxa"/>
+            <w:tcW w:w="1096" w:type="dxa"/>
             <w:vMerge/>
             <w:tcBorders>
               <w:left w:val="single" w:sz="4" w:space="0" w:color="000000"/>
@@ -6047,7 +6047,7 @@
         </w:tc>
         <w:tc>
           <w:tcPr>
-            <w:tcW w:w="846" w:type="dxa"/>
+            <w:tcW w:w="850" w:type="dxa"/>
             <w:tcBorders>
               <w:top w:val="single" w:sz="4" w:space="0" w:color="000000"/>
               <w:left w:val="single" w:sz="4" w:space="0" w:color="000000"/>
@@ -6076,49 +6076,49 @@
         </w:tc>
         <w:tc>
           <w:tcPr>
-            <w:tcW w:w="987" w:type="dxa"/>
-            <w:tcBorders>
-              <w:top w:val="single" w:sz="4" w:space="0" w:color="000000"/>
-              <w:left w:val="single" w:sz="4" w:space="0" w:color="000000"/>
-              <w:bottom w:val="single" w:sz="4" w:space="0" w:color="000000"/>
-              <w:right w:val="single" w:sz="4" w:space="0" w:color="000000"/>
-            </w:tcBorders>
-            <w:vAlign w:val="center"/>
-          </w:tcPr>
-          <w:p>
-            <w:pPr>
-              <w:rPr>
-                <w:rFonts w:ascii="Times New Roman" w:hAnsi="Times New Roman" w:cs="Times New Roman"/>
-                <w:sz w:val="26"/>
-                <w:szCs w:val="26"/>
-              </w:rPr>
-            </w:pPr>
-          </w:p>
-        </w:tc>
-        <w:tc>
-          <w:tcPr>
-            <w:tcW w:w="1144" w:type="dxa"/>
-            <w:tcBorders>
-              <w:top w:val="single" w:sz="4" w:space="0" w:color="000000"/>
-              <w:left w:val="single" w:sz="4" w:space="0" w:color="000000"/>
-              <w:bottom w:val="single" w:sz="4" w:space="0" w:color="000000"/>
-              <w:right w:val="single" w:sz="4" w:space="0" w:color="000000"/>
-            </w:tcBorders>
-            <w:vAlign w:val="center"/>
-          </w:tcPr>
-          <w:p>
-            <w:pPr>
-              <w:rPr>
-                <w:rFonts w:ascii="Times New Roman" w:hAnsi="Times New Roman" w:cs="Times New Roman"/>
-                <w:sz w:val="26"/>
-                <w:szCs w:val="26"/>
-              </w:rPr>
-            </w:pPr>
-          </w:p>
-        </w:tc>
-        <w:tc>
-          <w:tcPr>
             <w:tcW w:w="709" w:type="dxa"/>
+            <w:tcBorders>
+              <w:top w:val="single" w:sz="4" w:space="0" w:color="000000"/>
+              <w:left w:val="single" w:sz="4" w:space="0" w:color="000000"/>
+              <w:bottom w:val="single" w:sz="4" w:space="0" w:color="000000"/>
+              <w:right w:val="single" w:sz="4" w:space="0" w:color="000000"/>
+            </w:tcBorders>
+            <w:vAlign w:val="center"/>
+          </w:tcPr>
+          <w:p>
+            <w:pPr>
+              <w:rPr>
+                <w:rFonts w:ascii="Times New Roman" w:hAnsi="Times New Roman" w:cs="Times New Roman"/>
+                <w:sz w:val="26"/>
+                <w:szCs w:val="26"/>
+              </w:rPr>
+            </w:pPr>
+          </w:p>
+        </w:tc>
+        <w:tc>
+          <w:tcPr>
+            <w:tcW w:w="1276" w:type="dxa"/>
+            <w:tcBorders>
+              <w:top w:val="single" w:sz="4" w:space="0" w:color="000000"/>
+              <w:left w:val="single" w:sz="4" w:space="0" w:color="000000"/>
+              <w:bottom w:val="single" w:sz="4" w:space="0" w:color="000000"/>
+              <w:right w:val="single" w:sz="4" w:space="0" w:color="000000"/>
+            </w:tcBorders>
+            <w:vAlign w:val="center"/>
+          </w:tcPr>
+          <w:p>
+            <w:pPr>
+              <w:rPr>
+                <w:rFonts w:ascii="Times New Roman" w:hAnsi="Times New Roman" w:cs="Times New Roman"/>
+                <w:sz w:val="26"/>
+                <w:szCs w:val="26"/>
+              </w:rPr>
+            </w:pPr>
+          </w:p>
+        </w:tc>
+        <w:tc>
+          <w:tcPr>
+            <w:tcW w:w="992" w:type="dxa"/>
             <w:tcBorders>
               <w:top w:val="single" w:sz="4" w:space="0" w:color="000000"/>
               <w:left w:val="single" w:sz="4" w:space="0" w:color="000000"/>
@@ -6186,7 +6186,7 @@
         </w:trPr>
         <w:tc>
           <w:tcPr>
-            <w:tcW w:w="1237" w:type="dxa"/>
+            <w:tcW w:w="1096" w:type="dxa"/>
             <w:vMerge/>
             <w:tcBorders>
               <w:left w:val="single" w:sz="4" w:space="0" w:color="000000"/>
@@ -6208,7 +6208,7 @@
         </w:tc>
         <w:tc>
           <w:tcPr>
-            <w:tcW w:w="846" w:type="dxa"/>
+            <w:tcW w:w="850" w:type="dxa"/>
             <w:tcBorders>
               <w:top w:val="single" w:sz="4" w:space="0" w:color="000000"/>
               <w:left w:val="single" w:sz="4" w:space="0" w:color="000000"/>
@@ -6237,49 +6237,49 @@
         </w:tc>
         <w:tc>
           <w:tcPr>
-            <w:tcW w:w="987" w:type="dxa"/>
-            <w:tcBorders>
-              <w:top w:val="single" w:sz="4" w:space="0" w:color="000000"/>
-              <w:left w:val="single" w:sz="4" w:space="0" w:color="000000"/>
-              <w:bottom w:val="single" w:sz="4" w:space="0" w:color="000000"/>
-              <w:right w:val="single" w:sz="4" w:space="0" w:color="000000"/>
-            </w:tcBorders>
-            <w:vAlign w:val="center"/>
-          </w:tcPr>
-          <w:p>
-            <w:pPr>
-              <w:rPr>
-                <w:rFonts w:ascii="Times New Roman" w:hAnsi="Times New Roman" w:cs="Times New Roman"/>
-                <w:sz w:val="26"/>
-                <w:szCs w:val="26"/>
-              </w:rPr>
-            </w:pPr>
-          </w:p>
-        </w:tc>
-        <w:tc>
-          <w:tcPr>
-            <w:tcW w:w="1144" w:type="dxa"/>
-            <w:tcBorders>
-              <w:top w:val="single" w:sz="4" w:space="0" w:color="000000"/>
-              <w:left w:val="single" w:sz="4" w:space="0" w:color="000000"/>
-              <w:bottom w:val="single" w:sz="4" w:space="0" w:color="000000"/>
-              <w:right w:val="single" w:sz="4" w:space="0" w:color="000000"/>
-            </w:tcBorders>
-            <w:vAlign w:val="center"/>
-          </w:tcPr>
-          <w:p>
-            <w:pPr>
-              <w:rPr>
-                <w:rFonts w:ascii="Times New Roman" w:hAnsi="Times New Roman" w:cs="Times New Roman"/>
-                <w:sz w:val="26"/>
-                <w:szCs w:val="26"/>
-              </w:rPr>
-            </w:pPr>
-          </w:p>
-        </w:tc>
-        <w:tc>
-          <w:tcPr>
             <w:tcW w:w="709" w:type="dxa"/>
+            <w:tcBorders>
+              <w:top w:val="single" w:sz="4" w:space="0" w:color="000000"/>
+              <w:left w:val="single" w:sz="4" w:space="0" w:color="000000"/>
+              <w:bottom w:val="single" w:sz="4" w:space="0" w:color="000000"/>
+              <w:right w:val="single" w:sz="4" w:space="0" w:color="000000"/>
+            </w:tcBorders>
+            <w:vAlign w:val="center"/>
+          </w:tcPr>
+          <w:p>
+            <w:pPr>
+              <w:rPr>
+                <w:rFonts w:ascii="Times New Roman" w:hAnsi="Times New Roman" w:cs="Times New Roman"/>
+                <w:sz w:val="26"/>
+                <w:szCs w:val="26"/>
+              </w:rPr>
+            </w:pPr>
+          </w:p>
+        </w:tc>
+        <w:tc>
+          <w:tcPr>
+            <w:tcW w:w="1276" w:type="dxa"/>
+            <w:tcBorders>
+              <w:top w:val="single" w:sz="4" w:space="0" w:color="000000"/>
+              <w:left w:val="single" w:sz="4" w:space="0" w:color="000000"/>
+              <w:bottom w:val="single" w:sz="4" w:space="0" w:color="000000"/>
+              <w:right w:val="single" w:sz="4" w:space="0" w:color="000000"/>
+            </w:tcBorders>
+            <w:vAlign w:val="center"/>
+          </w:tcPr>
+          <w:p>
+            <w:pPr>
+              <w:rPr>
+                <w:rFonts w:ascii="Times New Roman" w:hAnsi="Times New Roman" w:cs="Times New Roman"/>
+                <w:sz w:val="26"/>
+                <w:szCs w:val="26"/>
+              </w:rPr>
+            </w:pPr>
+          </w:p>
+        </w:tc>
+        <w:tc>
+          <w:tcPr>
+            <w:tcW w:w="992" w:type="dxa"/>
             <w:tcBorders>
               <w:top w:val="single" w:sz="4" w:space="0" w:color="000000"/>
               <w:left w:val="single" w:sz="4" w:space="0" w:color="000000"/>
@@ -6347,7 +6347,7 @@
         </w:trPr>
         <w:tc>
           <w:tcPr>
-            <w:tcW w:w="1237" w:type="dxa"/>
+            <w:tcW w:w="1096" w:type="dxa"/>
             <w:vMerge/>
             <w:tcBorders>
               <w:left w:val="single" w:sz="4" w:space="0" w:color="000000"/>
@@ -6369,7 +6369,7 @@
         </w:tc>
         <w:tc>
           <w:tcPr>
-            <w:tcW w:w="846" w:type="dxa"/>
+            <w:tcW w:w="850" w:type="dxa"/>
             <w:tcBorders>
               <w:top w:val="single" w:sz="4" w:space="0" w:color="000000"/>
               <w:left w:val="single" w:sz="4" w:space="0" w:color="000000"/>
@@ -6398,49 +6398,49 @@
         </w:tc>
         <w:tc>
           <w:tcPr>
-            <w:tcW w:w="987" w:type="dxa"/>
-            <w:tcBorders>
-              <w:top w:val="single" w:sz="4" w:space="0" w:color="000000"/>
-              <w:left w:val="single" w:sz="4" w:space="0" w:color="000000"/>
-              <w:bottom w:val="single" w:sz="4" w:space="0" w:color="000000"/>
-              <w:right w:val="single" w:sz="4" w:space="0" w:color="000000"/>
-            </w:tcBorders>
-            <w:vAlign w:val="center"/>
-          </w:tcPr>
-          <w:p>
-            <w:pPr>
-              <w:rPr>
-                <w:rFonts w:ascii="Times New Roman" w:hAnsi="Times New Roman" w:cs="Times New Roman"/>
-                <w:sz w:val="26"/>
-                <w:szCs w:val="26"/>
-              </w:rPr>
-            </w:pPr>
-          </w:p>
-        </w:tc>
-        <w:tc>
-          <w:tcPr>
-            <w:tcW w:w="1144" w:type="dxa"/>
-            <w:tcBorders>
-              <w:top w:val="single" w:sz="4" w:space="0" w:color="000000"/>
-              <w:left w:val="single" w:sz="4" w:space="0" w:color="000000"/>
-              <w:bottom w:val="single" w:sz="4" w:space="0" w:color="000000"/>
-              <w:right w:val="single" w:sz="4" w:space="0" w:color="000000"/>
-            </w:tcBorders>
-            <w:vAlign w:val="center"/>
-          </w:tcPr>
-          <w:p>
-            <w:pPr>
-              <w:rPr>
-                <w:rFonts w:ascii="Times New Roman" w:hAnsi="Times New Roman" w:cs="Times New Roman"/>
-                <w:sz w:val="26"/>
-                <w:szCs w:val="26"/>
-              </w:rPr>
-            </w:pPr>
-          </w:p>
-        </w:tc>
-        <w:tc>
-          <w:tcPr>
             <w:tcW w:w="709" w:type="dxa"/>
+            <w:tcBorders>
+              <w:top w:val="single" w:sz="4" w:space="0" w:color="000000"/>
+              <w:left w:val="single" w:sz="4" w:space="0" w:color="000000"/>
+              <w:bottom w:val="single" w:sz="4" w:space="0" w:color="000000"/>
+              <w:right w:val="single" w:sz="4" w:space="0" w:color="000000"/>
+            </w:tcBorders>
+            <w:vAlign w:val="center"/>
+          </w:tcPr>
+          <w:p>
+            <w:pPr>
+              <w:rPr>
+                <w:rFonts w:ascii="Times New Roman" w:hAnsi="Times New Roman" w:cs="Times New Roman"/>
+                <w:sz w:val="26"/>
+                <w:szCs w:val="26"/>
+              </w:rPr>
+            </w:pPr>
+          </w:p>
+        </w:tc>
+        <w:tc>
+          <w:tcPr>
+            <w:tcW w:w="1276" w:type="dxa"/>
+            <w:tcBorders>
+              <w:top w:val="single" w:sz="4" w:space="0" w:color="000000"/>
+              <w:left w:val="single" w:sz="4" w:space="0" w:color="000000"/>
+              <w:bottom w:val="single" w:sz="4" w:space="0" w:color="000000"/>
+              <w:right w:val="single" w:sz="4" w:space="0" w:color="000000"/>
+            </w:tcBorders>
+            <w:vAlign w:val="center"/>
+          </w:tcPr>
+          <w:p>
+            <w:pPr>
+              <w:rPr>
+                <w:rFonts w:ascii="Times New Roman" w:hAnsi="Times New Roman" w:cs="Times New Roman"/>
+                <w:sz w:val="26"/>
+                <w:szCs w:val="26"/>
+              </w:rPr>
+            </w:pPr>
+          </w:p>
+        </w:tc>
+        <w:tc>
+          <w:tcPr>
+            <w:tcW w:w="992" w:type="dxa"/>
             <w:tcBorders>
               <w:top w:val="single" w:sz="4" w:space="0" w:color="000000"/>
               <w:left w:val="single" w:sz="4" w:space="0" w:color="000000"/>
@@ -6508,7 +6508,7 @@
         </w:trPr>
         <w:tc>
           <w:tcPr>
-            <w:tcW w:w="1237" w:type="dxa"/>
+            <w:tcW w:w="1096" w:type="dxa"/>
             <w:vMerge/>
             <w:tcBorders>
               <w:left w:val="single" w:sz="4" w:space="0" w:color="000000"/>
@@ -6530,7 +6530,7 @@
         </w:tc>
         <w:tc>
           <w:tcPr>
-            <w:tcW w:w="846" w:type="dxa"/>
+            <w:tcW w:w="850" w:type="dxa"/>
             <w:tcBorders>
               <w:top w:val="single" w:sz="4" w:space="0" w:color="000000"/>
               <w:left w:val="single" w:sz="4" w:space="0" w:color="000000"/>
@@ -6559,49 +6559,49 @@
         </w:tc>
         <w:tc>
           <w:tcPr>
-            <w:tcW w:w="987" w:type="dxa"/>
-            <w:tcBorders>
-              <w:top w:val="single" w:sz="4" w:space="0" w:color="000000"/>
-              <w:left w:val="single" w:sz="4" w:space="0" w:color="000000"/>
-              <w:bottom w:val="single" w:sz="4" w:space="0" w:color="000000"/>
-              <w:right w:val="single" w:sz="4" w:space="0" w:color="000000"/>
-            </w:tcBorders>
-            <w:vAlign w:val="center"/>
-          </w:tcPr>
-          <w:p>
-            <w:pPr>
-              <w:rPr>
-                <w:rFonts w:ascii="Times New Roman" w:hAnsi="Times New Roman" w:cs="Times New Roman"/>
-                <w:sz w:val="26"/>
-                <w:szCs w:val="26"/>
-              </w:rPr>
-            </w:pPr>
-          </w:p>
-        </w:tc>
-        <w:tc>
-          <w:tcPr>
-            <w:tcW w:w="1144" w:type="dxa"/>
-            <w:tcBorders>
-              <w:top w:val="single" w:sz="4" w:space="0" w:color="000000"/>
-              <w:left w:val="single" w:sz="4" w:space="0" w:color="000000"/>
-              <w:bottom w:val="single" w:sz="4" w:space="0" w:color="000000"/>
-              <w:right w:val="single" w:sz="4" w:space="0" w:color="000000"/>
-            </w:tcBorders>
-            <w:vAlign w:val="center"/>
-          </w:tcPr>
-          <w:p>
-            <w:pPr>
-              <w:rPr>
-                <w:rFonts w:ascii="Times New Roman" w:hAnsi="Times New Roman" w:cs="Times New Roman"/>
-                <w:sz w:val="26"/>
-                <w:szCs w:val="26"/>
-              </w:rPr>
-            </w:pPr>
-          </w:p>
-        </w:tc>
-        <w:tc>
-          <w:tcPr>
             <w:tcW w:w="709" w:type="dxa"/>
+            <w:tcBorders>
+              <w:top w:val="single" w:sz="4" w:space="0" w:color="000000"/>
+              <w:left w:val="single" w:sz="4" w:space="0" w:color="000000"/>
+              <w:bottom w:val="single" w:sz="4" w:space="0" w:color="000000"/>
+              <w:right w:val="single" w:sz="4" w:space="0" w:color="000000"/>
+            </w:tcBorders>
+            <w:vAlign w:val="center"/>
+          </w:tcPr>
+          <w:p>
+            <w:pPr>
+              <w:rPr>
+                <w:rFonts w:ascii="Times New Roman" w:hAnsi="Times New Roman" w:cs="Times New Roman"/>
+                <w:sz w:val="26"/>
+                <w:szCs w:val="26"/>
+              </w:rPr>
+            </w:pPr>
+          </w:p>
+        </w:tc>
+        <w:tc>
+          <w:tcPr>
+            <w:tcW w:w="1276" w:type="dxa"/>
+            <w:tcBorders>
+              <w:top w:val="single" w:sz="4" w:space="0" w:color="000000"/>
+              <w:left w:val="single" w:sz="4" w:space="0" w:color="000000"/>
+              <w:bottom w:val="single" w:sz="4" w:space="0" w:color="000000"/>
+              <w:right w:val="single" w:sz="4" w:space="0" w:color="000000"/>
+            </w:tcBorders>
+            <w:vAlign w:val="center"/>
+          </w:tcPr>
+          <w:p>
+            <w:pPr>
+              <w:rPr>
+                <w:rFonts w:ascii="Times New Roman" w:hAnsi="Times New Roman" w:cs="Times New Roman"/>
+                <w:sz w:val="26"/>
+                <w:szCs w:val="26"/>
+              </w:rPr>
+            </w:pPr>
+          </w:p>
+        </w:tc>
+        <w:tc>
+          <w:tcPr>
+            <w:tcW w:w="992" w:type="dxa"/>
             <w:tcBorders>
               <w:top w:val="single" w:sz="4" w:space="0" w:color="000000"/>
               <w:left w:val="single" w:sz="4" w:space="0" w:color="000000"/>
@@ -6669,7 +6669,7 @@
         </w:trPr>
         <w:tc>
           <w:tcPr>
-            <w:tcW w:w="1237" w:type="dxa"/>
+            <w:tcW w:w="1096" w:type="dxa"/>
             <w:vMerge w:val="restart"/>
             <w:tcBorders>
               <w:left w:val="single" w:sz="4" w:space="0" w:color="000000"/>
@@ -6697,7 +6697,7 @@
         </w:tc>
         <w:tc>
           <w:tcPr>
-            <w:tcW w:w="846" w:type="dxa"/>
+            <w:tcW w:w="850" w:type="dxa"/>
             <w:tcBorders>
               <w:top w:val="single" w:sz="4" w:space="0" w:color="000000"/>
               <w:left w:val="single" w:sz="4" w:space="0" w:color="000000"/>
@@ -6726,7 +6726,7 @@
         </w:tc>
         <w:tc>
           <w:tcPr>
-            <w:tcW w:w="987" w:type="dxa"/>
+            <w:tcW w:w="709" w:type="dxa"/>
             <w:tcBorders>
               <w:top w:val="single" w:sz="4" w:space="0" w:color="000000"/>
               <w:left w:val="single" w:sz="4" w:space="0" w:color="000000"/>
@@ -6755,7 +6755,7 @@
         </w:tc>
         <w:tc>
           <w:tcPr>
-            <w:tcW w:w="1144" w:type="dxa"/>
+            <w:tcW w:w="1276" w:type="dxa"/>
             <w:tcBorders>
               <w:top w:val="single" w:sz="4" w:space="0" w:color="000000"/>
               <w:left w:val="single" w:sz="4" w:space="0" w:color="000000"/>
@@ -6784,7 +6784,7 @@
         </w:tc>
         <w:tc>
           <w:tcPr>
-            <w:tcW w:w="709" w:type="dxa"/>
+            <w:tcW w:w="992" w:type="dxa"/>
             <w:tcBorders>
               <w:top w:val="single" w:sz="4" w:space="0" w:color="000000"/>
               <w:left w:val="single" w:sz="4" w:space="0" w:color="000000"/>
@@ -6876,7 +6876,7 @@
         </w:trPr>
         <w:tc>
           <w:tcPr>
-            <w:tcW w:w="1237" w:type="dxa"/>
+            <w:tcW w:w="1096" w:type="dxa"/>
             <w:vMerge/>
             <w:tcBorders>
               <w:left w:val="single" w:sz="4" w:space="0" w:color="000000"/>
@@ -6900,7 +6900,7 @@
         </w:tc>
         <w:tc>
           <w:tcPr>
-            <w:tcW w:w="846" w:type="dxa"/>
+            <w:tcW w:w="850" w:type="dxa"/>
             <w:tcBorders>
               <w:top w:val="single" w:sz="4" w:space="0" w:color="000000"/>
               <w:left w:val="single" w:sz="4" w:space="0" w:color="000000"/>
@@ -6929,7 +6929,7 @@
         </w:tc>
         <w:tc>
           <w:tcPr>
-            <w:tcW w:w="987" w:type="dxa"/>
+            <w:tcW w:w="709" w:type="dxa"/>
             <w:tcBorders>
               <w:top w:val="single" w:sz="4" w:space="0" w:color="000000"/>
               <w:left w:val="single" w:sz="4" w:space="0" w:color="000000"/>
@@ -6958,7 +6958,7 @@
         </w:tc>
         <w:tc>
           <w:tcPr>
-            <w:tcW w:w="1144" w:type="dxa"/>
+            <w:tcW w:w="1276" w:type="dxa"/>
             <w:tcBorders>
               <w:top w:val="single" w:sz="4" w:space="0" w:color="000000"/>
               <w:left w:val="single" w:sz="4" w:space="0" w:color="000000"/>
@@ -6987,7 +6987,7 @@
         </w:tc>
         <w:tc>
           <w:tcPr>
-            <w:tcW w:w="709" w:type="dxa"/>
+            <w:tcW w:w="992" w:type="dxa"/>
             <w:tcBorders>
               <w:top w:val="single" w:sz="4" w:space="0" w:color="000000"/>
               <w:left w:val="single" w:sz="4" w:space="0" w:color="000000"/>
@@ -7079,7 +7079,7 @@
         </w:trPr>
         <w:tc>
           <w:tcPr>
-            <w:tcW w:w="1237" w:type="dxa"/>
+            <w:tcW w:w="1096" w:type="dxa"/>
             <w:vMerge/>
             <w:tcBorders>
               <w:left w:val="single" w:sz="4" w:space="0" w:color="000000"/>
@@ -7103,7 +7103,7 @@
         </w:tc>
         <w:tc>
           <w:tcPr>
-            <w:tcW w:w="846" w:type="dxa"/>
+            <w:tcW w:w="850" w:type="dxa"/>
             <w:tcBorders>
               <w:top w:val="single" w:sz="4" w:space="0" w:color="000000"/>
               <w:left w:val="single" w:sz="4" w:space="0" w:color="000000"/>
@@ -7132,7 +7132,7 @@
         </w:tc>
         <w:tc>
           <w:tcPr>
-            <w:tcW w:w="987" w:type="dxa"/>
+            <w:tcW w:w="709" w:type="dxa"/>
             <w:tcBorders>
               <w:top w:val="single" w:sz="4" w:space="0" w:color="000000"/>
               <w:left w:val="single" w:sz="4" w:space="0" w:color="000000"/>
@@ -7161,7 +7161,7 @@
         </w:tc>
         <w:tc>
           <w:tcPr>
-            <w:tcW w:w="1144" w:type="dxa"/>
+            <w:tcW w:w="1276" w:type="dxa"/>
             <w:tcBorders>
               <w:top w:val="single" w:sz="4" w:space="0" w:color="000000"/>
               <w:left w:val="single" w:sz="4" w:space="0" w:color="000000"/>
@@ -7190,7 +7190,7 @@
         </w:tc>
         <w:tc>
           <w:tcPr>
-            <w:tcW w:w="709" w:type="dxa"/>
+            <w:tcW w:w="992" w:type="dxa"/>
             <w:tcBorders>
               <w:top w:val="single" w:sz="4" w:space="0" w:color="000000"/>
               <w:left w:val="single" w:sz="4" w:space="0" w:color="000000"/>
@@ -7282,7 +7282,7 @@
         </w:trPr>
         <w:tc>
           <w:tcPr>
-            <w:tcW w:w="1237" w:type="dxa"/>
+            <w:tcW w:w="1096" w:type="dxa"/>
             <w:vMerge/>
             <w:tcBorders>
               <w:left w:val="single" w:sz="4" w:space="0" w:color="000000"/>
@@ -7306,7 +7306,7 @@
         </w:tc>
         <w:tc>
           <w:tcPr>
-            <w:tcW w:w="846" w:type="dxa"/>
+            <w:tcW w:w="850" w:type="dxa"/>
             <w:tcBorders>
               <w:top w:val="single" w:sz="4" w:space="0" w:color="000000"/>
               <w:left w:val="single" w:sz="4" w:space="0" w:color="000000"/>
@@ -7335,7 +7335,7 @@
         </w:tc>
         <w:tc>
           <w:tcPr>
-            <w:tcW w:w="987" w:type="dxa"/>
+            <w:tcW w:w="709" w:type="dxa"/>
             <w:tcBorders>
               <w:top w:val="single" w:sz="4" w:space="0" w:color="000000"/>
               <w:left w:val="single" w:sz="4" w:space="0" w:color="000000"/>
@@ -7364,7 +7364,7 @@
         </w:tc>
         <w:tc>
           <w:tcPr>
-            <w:tcW w:w="1144" w:type="dxa"/>
+            <w:tcW w:w="1276" w:type="dxa"/>
             <w:tcBorders>
               <w:top w:val="single" w:sz="4" w:space="0" w:color="000000"/>
               <w:left w:val="single" w:sz="4" w:space="0" w:color="000000"/>
@@ -7393,7 +7393,7 @@
         </w:tc>
         <w:tc>
           <w:tcPr>
-            <w:tcW w:w="709" w:type="dxa"/>
+            <w:tcW w:w="992" w:type="dxa"/>
             <w:tcBorders>
               <w:top w:val="single" w:sz="4" w:space="0" w:color="000000"/>
               <w:left w:val="single" w:sz="4" w:space="0" w:color="000000"/>
@@ -7485,7 +7485,7 @@
         </w:trPr>
         <w:tc>
           <w:tcPr>
-            <w:tcW w:w="1237" w:type="dxa"/>
+            <w:tcW w:w="1096" w:type="dxa"/>
             <w:vMerge/>
             <w:tcBorders>
               <w:left w:val="single" w:sz="4" w:space="0" w:color="000000"/>
@@ -7509,7 +7509,7 @@
         </w:tc>
         <w:tc>
           <w:tcPr>
-            <w:tcW w:w="846" w:type="dxa"/>
+            <w:tcW w:w="850" w:type="dxa"/>
             <w:tcBorders>
               <w:top w:val="single" w:sz="4" w:space="0" w:color="000000"/>
               <w:left w:val="single" w:sz="4" w:space="0" w:color="000000"/>
@@ -7538,49 +7538,49 @@
         </w:tc>
         <w:tc>
           <w:tcPr>
-            <w:tcW w:w="987" w:type="dxa"/>
-            <w:tcBorders>
-              <w:top w:val="single" w:sz="4" w:space="0" w:color="000000"/>
-              <w:left w:val="single" w:sz="4" w:space="0" w:color="000000"/>
-              <w:bottom w:val="single" w:sz="4" w:space="0" w:color="000000"/>
-              <w:right w:val="single" w:sz="4" w:space="0" w:color="000000"/>
-            </w:tcBorders>
-            <w:vAlign w:val="center"/>
-          </w:tcPr>
-          <w:p>
-            <w:pPr>
-              <w:rPr>
-                <w:rFonts w:ascii="Times New Roman" w:hAnsi="Times New Roman" w:cs="Times New Roman"/>
-                <w:sz w:val="26"/>
-                <w:szCs w:val="26"/>
-              </w:rPr>
-            </w:pPr>
-          </w:p>
-        </w:tc>
-        <w:tc>
-          <w:tcPr>
-            <w:tcW w:w="1144" w:type="dxa"/>
-            <w:tcBorders>
-              <w:top w:val="single" w:sz="4" w:space="0" w:color="000000"/>
-              <w:left w:val="single" w:sz="4" w:space="0" w:color="000000"/>
-              <w:bottom w:val="single" w:sz="4" w:space="0" w:color="000000"/>
-              <w:right w:val="single" w:sz="4" w:space="0" w:color="000000"/>
-            </w:tcBorders>
-            <w:vAlign w:val="center"/>
-          </w:tcPr>
-          <w:p>
-            <w:pPr>
-              <w:rPr>
-                <w:rFonts w:ascii="Times New Roman" w:hAnsi="Times New Roman" w:cs="Times New Roman"/>
-                <w:sz w:val="26"/>
-                <w:szCs w:val="26"/>
-              </w:rPr>
-            </w:pPr>
-          </w:p>
-        </w:tc>
-        <w:tc>
-          <w:tcPr>
             <w:tcW w:w="709" w:type="dxa"/>
+            <w:tcBorders>
+              <w:top w:val="single" w:sz="4" w:space="0" w:color="000000"/>
+              <w:left w:val="single" w:sz="4" w:space="0" w:color="000000"/>
+              <w:bottom w:val="single" w:sz="4" w:space="0" w:color="000000"/>
+              <w:right w:val="single" w:sz="4" w:space="0" w:color="000000"/>
+            </w:tcBorders>
+            <w:vAlign w:val="center"/>
+          </w:tcPr>
+          <w:p>
+            <w:pPr>
+              <w:rPr>
+                <w:rFonts w:ascii="Times New Roman" w:hAnsi="Times New Roman" w:cs="Times New Roman"/>
+                <w:sz w:val="26"/>
+                <w:szCs w:val="26"/>
+              </w:rPr>
+            </w:pPr>
+          </w:p>
+        </w:tc>
+        <w:tc>
+          <w:tcPr>
+            <w:tcW w:w="1276" w:type="dxa"/>
+            <w:tcBorders>
+              <w:top w:val="single" w:sz="4" w:space="0" w:color="000000"/>
+              <w:left w:val="single" w:sz="4" w:space="0" w:color="000000"/>
+              <w:bottom w:val="single" w:sz="4" w:space="0" w:color="000000"/>
+              <w:right w:val="single" w:sz="4" w:space="0" w:color="000000"/>
+            </w:tcBorders>
+            <w:vAlign w:val="center"/>
+          </w:tcPr>
+          <w:p>
+            <w:pPr>
+              <w:rPr>
+                <w:rFonts w:ascii="Times New Roman" w:hAnsi="Times New Roman" w:cs="Times New Roman"/>
+                <w:sz w:val="26"/>
+                <w:szCs w:val="26"/>
+              </w:rPr>
+            </w:pPr>
+          </w:p>
+        </w:tc>
+        <w:tc>
+          <w:tcPr>
+            <w:tcW w:w="992" w:type="dxa"/>
             <w:tcBorders>
               <w:top w:val="single" w:sz="4" w:space="0" w:color="000000"/>
               <w:left w:val="single" w:sz="4" w:space="0" w:color="000000"/>
@@ -7648,7 +7648,7 @@
         </w:trPr>
         <w:tc>
           <w:tcPr>
-            <w:tcW w:w="1237" w:type="dxa"/>
+            <w:tcW w:w="1096" w:type="dxa"/>
             <w:vMerge w:val="restart"/>
             <w:tcBorders>
               <w:left w:val="single" w:sz="4" w:space="0" w:color="000000"/>
@@ -7676,7 +7676,7 @@
         </w:tc>
         <w:tc>
           <w:tcPr>
-            <w:tcW w:w="846" w:type="dxa"/>
+            <w:tcW w:w="850" w:type="dxa"/>
             <w:tcBorders>
               <w:top w:val="single" w:sz="4" w:space="0" w:color="000000"/>
               <w:left w:val="single" w:sz="4" w:space="0" w:color="000000"/>
@@ -7705,49 +7705,49 @@
         </w:tc>
         <w:tc>
           <w:tcPr>
-            <w:tcW w:w="987" w:type="dxa"/>
-            <w:tcBorders>
-              <w:top w:val="single" w:sz="4" w:space="0" w:color="000000"/>
-              <w:left w:val="single" w:sz="4" w:space="0" w:color="000000"/>
-              <w:bottom w:val="single" w:sz="4" w:space="0" w:color="000000"/>
-              <w:right w:val="single" w:sz="4" w:space="0" w:color="000000"/>
-            </w:tcBorders>
-            <w:vAlign w:val="center"/>
-          </w:tcPr>
-          <w:p>
-            <w:pPr>
-              <w:rPr>
-                <w:rFonts w:ascii="Times New Roman" w:hAnsi="Times New Roman" w:cs="Times New Roman"/>
-                <w:sz w:val="26"/>
-                <w:szCs w:val="26"/>
-              </w:rPr>
-            </w:pPr>
-          </w:p>
-        </w:tc>
-        <w:tc>
-          <w:tcPr>
-            <w:tcW w:w="1144" w:type="dxa"/>
-            <w:tcBorders>
-              <w:top w:val="single" w:sz="4" w:space="0" w:color="000000"/>
-              <w:left w:val="single" w:sz="4" w:space="0" w:color="000000"/>
-              <w:bottom w:val="single" w:sz="4" w:space="0" w:color="000000"/>
-              <w:right w:val="single" w:sz="4" w:space="0" w:color="000000"/>
-            </w:tcBorders>
-            <w:vAlign w:val="center"/>
-          </w:tcPr>
-          <w:p>
-            <w:pPr>
-              <w:rPr>
-                <w:rFonts w:ascii="Times New Roman" w:hAnsi="Times New Roman" w:cs="Times New Roman"/>
-                <w:sz w:val="26"/>
-                <w:szCs w:val="26"/>
-              </w:rPr>
-            </w:pPr>
-          </w:p>
-        </w:tc>
-        <w:tc>
-          <w:tcPr>
             <w:tcW w:w="709" w:type="dxa"/>
+            <w:tcBorders>
+              <w:top w:val="single" w:sz="4" w:space="0" w:color="000000"/>
+              <w:left w:val="single" w:sz="4" w:space="0" w:color="000000"/>
+              <w:bottom w:val="single" w:sz="4" w:space="0" w:color="000000"/>
+              <w:right w:val="single" w:sz="4" w:space="0" w:color="000000"/>
+            </w:tcBorders>
+            <w:vAlign w:val="center"/>
+          </w:tcPr>
+          <w:p>
+            <w:pPr>
+              <w:rPr>
+                <w:rFonts w:ascii="Times New Roman" w:hAnsi="Times New Roman" w:cs="Times New Roman"/>
+                <w:sz w:val="26"/>
+                <w:szCs w:val="26"/>
+              </w:rPr>
+            </w:pPr>
+          </w:p>
+        </w:tc>
+        <w:tc>
+          <w:tcPr>
+            <w:tcW w:w="1276" w:type="dxa"/>
+            <w:tcBorders>
+              <w:top w:val="single" w:sz="4" w:space="0" w:color="000000"/>
+              <w:left w:val="single" w:sz="4" w:space="0" w:color="000000"/>
+              <w:bottom w:val="single" w:sz="4" w:space="0" w:color="000000"/>
+              <w:right w:val="single" w:sz="4" w:space="0" w:color="000000"/>
+            </w:tcBorders>
+            <w:vAlign w:val="center"/>
+          </w:tcPr>
+          <w:p>
+            <w:pPr>
+              <w:rPr>
+                <w:rFonts w:ascii="Times New Roman" w:hAnsi="Times New Roman" w:cs="Times New Roman"/>
+                <w:sz w:val="26"/>
+                <w:szCs w:val="26"/>
+              </w:rPr>
+            </w:pPr>
+          </w:p>
+        </w:tc>
+        <w:tc>
+          <w:tcPr>
+            <w:tcW w:w="992" w:type="dxa"/>
             <w:tcBorders>
               <w:top w:val="single" w:sz="4" w:space="0" w:color="000000"/>
               <w:left w:val="single" w:sz="4" w:space="0" w:color="000000"/>
@@ -7815,7 +7815,7 @@
         </w:trPr>
         <w:tc>
           <w:tcPr>
-            <w:tcW w:w="1237" w:type="dxa"/>
+            <w:tcW w:w="1096" w:type="dxa"/>
             <w:vMerge/>
             <w:tcBorders>
               <w:left w:val="single" w:sz="4" w:space="0" w:color="000000"/>
@@ -7839,7 +7839,7 @@
         </w:tc>
         <w:tc>
           <w:tcPr>
-            <w:tcW w:w="846" w:type="dxa"/>
+            <w:tcW w:w="850" w:type="dxa"/>
             <w:tcBorders>
               <w:top w:val="single" w:sz="4" w:space="0" w:color="000000"/>
               <w:left w:val="single" w:sz="4" w:space="0" w:color="000000"/>
@@ -7868,49 +7868,49 @@
         </w:tc>
         <w:tc>
           <w:tcPr>
-            <w:tcW w:w="987" w:type="dxa"/>
-            <w:tcBorders>
-              <w:top w:val="single" w:sz="4" w:space="0" w:color="000000"/>
-              <w:left w:val="single" w:sz="4" w:space="0" w:color="000000"/>
-              <w:bottom w:val="single" w:sz="4" w:space="0" w:color="000000"/>
-              <w:right w:val="single" w:sz="4" w:space="0" w:color="000000"/>
-            </w:tcBorders>
-            <w:vAlign w:val="center"/>
-          </w:tcPr>
-          <w:p>
-            <w:pPr>
-              <w:rPr>
-                <w:rFonts w:ascii="Times New Roman" w:hAnsi="Times New Roman" w:cs="Times New Roman"/>
-                <w:sz w:val="26"/>
-                <w:szCs w:val="26"/>
-              </w:rPr>
-            </w:pPr>
-          </w:p>
-        </w:tc>
-        <w:tc>
-          <w:tcPr>
-            <w:tcW w:w="1144" w:type="dxa"/>
-            <w:tcBorders>
-              <w:top w:val="single" w:sz="4" w:space="0" w:color="000000"/>
-              <w:left w:val="single" w:sz="4" w:space="0" w:color="000000"/>
-              <w:bottom w:val="single" w:sz="4" w:space="0" w:color="000000"/>
-              <w:right w:val="single" w:sz="4" w:space="0" w:color="000000"/>
-            </w:tcBorders>
-            <w:vAlign w:val="center"/>
-          </w:tcPr>
-          <w:p>
-            <w:pPr>
-              <w:rPr>
-                <w:rFonts w:ascii="Times New Roman" w:hAnsi="Times New Roman" w:cs="Times New Roman"/>
-                <w:sz w:val="26"/>
-                <w:szCs w:val="26"/>
-              </w:rPr>
-            </w:pPr>
-          </w:p>
-        </w:tc>
-        <w:tc>
-          <w:tcPr>
             <w:tcW w:w="709" w:type="dxa"/>
+            <w:tcBorders>
+              <w:top w:val="single" w:sz="4" w:space="0" w:color="000000"/>
+              <w:left w:val="single" w:sz="4" w:space="0" w:color="000000"/>
+              <w:bottom w:val="single" w:sz="4" w:space="0" w:color="000000"/>
+              <w:right w:val="single" w:sz="4" w:space="0" w:color="000000"/>
+            </w:tcBorders>
+            <w:vAlign w:val="center"/>
+          </w:tcPr>
+          <w:p>
+            <w:pPr>
+              <w:rPr>
+                <w:rFonts w:ascii="Times New Roman" w:hAnsi="Times New Roman" w:cs="Times New Roman"/>
+                <w:sz w:val="26"/>
+                <w:szCs w:val="26"/>
+              </w:rPr>
+            </w:pPr>
+          </w:p>
+        </w:tc>
+        <w:tc>
+          <w:tcPr>
+            <w:tcW w:w="1276" w:type="dxa"/>
+            <w:tcBorders>
+              <w:top w:val="single" w:sz="4" w:space="0" w:color="000000"/>
+              <w:left w:val="single" w:sz="4" w:space="0" w:color="000000"/>
+              <w:bottom w:val="single" w:sz="4" w:space="0" w:color="000000"/>
+              <w:right w:val="single" w:sz="4" w:space="0" w:color="000000"/>
+            </w:tcBorders>
+            <w:vAlign w:val="center"/>
+          </w:tcPr>
+          <w:p>
+            <w:pPr>
+              <w:rPr>
+                <w:rFonts w:ascii="Times New Roman" w:hAnsi="Times New Roman" w:cs="Times New Roman"/>
+                <w:sz w:val="26"/>
+                <w:szCs w:val="26"/>
+              </w:rPr>
+            </w:pPr>
+          </w:p>
+        </w:tc>
+        <w:tc>
+          <w:tcPr>
+            <w:tcW w:w="992" w:type="dxa"/>
             <w:tcBorders>
               <w:top w:val="single" w:sz="4" w:space="0" w:color="000000"/>
               <w:left w:val="single" w:sz="4" w:space="0" w:color="000000"/>
@@ -7978,7 +7978,7 @@
         </w:trPr>
         <w:tc>
           <w:tcPr>
-            <w:tcW w:w="1237" w:type="dxa"/>
+            <w:tcW w:w="1096" w:type="dxa"/>
             <w:vMerge/>
             <w:tcBorders>
               <w:left w:val="single" w:sz="4" w:space="0" w:color="000000"/>
@@ -8002,7 +8002,7 @@
         </w:tc>
         <w:tc>
           <w:tcPr>
-            <w:tcW w:w="846" w:type="dxa"/>
+            <w:tcW w:w="850" w:type="dxa"/>
             <w:tcBorders>
               <w:top w:val="single" w:sz="4" w:space="0" w:color="000000"/>
               <w:left w:val="single" w:sz="4" w:space="0" w:color="000000"/>
@@ -8031,7 +8031,7 @@
         </w:tc>
         <w:tc>
           <w:tcPr>
-            <w:tcW w:w="987" w:type="dxa"/>
+            <w:tcW w:w="709" w:type="dxa"/>
             <w:tcBorders>
               <w:top w:val="single" w:sz="4" w:space="0" w:color="000000"/>
               <w:left w:val="single" w:sz="4" w:space="0" w:color="000000"/>
@@ -8060,7 +8060,7 @@
         </w:tc>
         <w:tc>
           <w:tcPr>
-            <w:tcW w:w="1144" w:type="dxa"/>
+            <w:tcW w:w="1276" w:type="dxa"/>
             <w:tcBorders>
               <w:top w:val="single" w:sz="4" w:space="0" w:color="000000"/>
               <w:left w:val="single" w:sz="4" w:space="0" w:color="000000"/>
@@ -8089,7 +8089,7 @@
         </w:tc>
         <w:tc>
           <w:tcPr>
-            <w:tcW w:w="709" w:type="dxa"/>
+            <w:tcW w:w="992" w:type="dxa"/>
             <w:tcBorders>
               <w:top w:val="single" w:sz="4" w:space="0" w:color="000000"/>
               <w:left w:val="single" w:sz="4" w:space="0" w:color="000000"/>
@@ -8181,7 +8181,7 @@
         </w:trPr>
         <w:tc>
           <w:tcPr>
-            <w:tcW w:w="1237" w:type="dxa"/>
+            <w:tcW w:w="1096" w:type="dxa"/>
             <w:vMerge/>
             <w:tcBorders>
               <w:left w:val="single" w:sz="4" w:space="0" w:color="000000"/>
@@ -8205,7 +8205,7 @@
         </w:tc>
         <w:tc>
           <w:tcPr>
-            <w:tcW w:w="846" w:type="dxa"/>
+            <w:tcW w:w="850" w:type="dxa"/>
             <w:tcBorders>
               <w:top w:val="single" w:sz="4" w:space="0" w:color="000000"/>
               <w:left w:val="single" w:sz="4" w:space="0" w:color="000000"/>
@@ -8234,7 +8234,7 @@
         </w:tc>
         <w:tc>
           <w:tcPr>
-            <w:tcW w:w="987" w:type="dxa"/>
+            <w:tcW w:w="709" w:type="dxa"/>
             <w:tcBorders>
               <w:top w:val="single" w:sz="4" w:space="0" w:color="000000"/>
               <w:left w:val="single" w:sz="4" w:space="0" w:color="000000"/>
@@ -8263,7 +8263,7 @@
         </w:tc>
         <w:tc>
           <w:tcPr>
-            <w:tcW w:w="1144" w:type="dxa"/>
+            <w:tcW w:w="1276" w:type="dxa"/>
             <w:tcBorders>
               <w:top w:val="single" w:sz="4" w:space="0" w:color="000000"/>
               <w:left w:val="single" w:sz="4" w:space="0" w:color="000000"/>
@@ -8292,7 +8292,7 @@
         </w:tc>
         <w:tc>
           <w:tcPr>
-            <w:tcW w:w="709" w:type="dxa"/>
+            <w:tcW w:w="992" w:type="dxa"/>
             <w:tcBorders>
               <w:top w:val="single" w:sz="4" w:space="0" w:color="000000"/>
               <w:left w:val="single" w:sz="4" w:space="0" w:color="000000"/>
@@ -8384,7 +8384,7 @@
         </w:trPr>
         <w:tc>
           <w:tcPr>
-            <w:tcW w:w="1237" w:type="dxa"/>
+            <w:tcW w:w="1096" w:type="dxa"/>
             <w:vMerge/>
             <w:tcBorders>
               <w:left w:val="single" w:sz="4" w:space="0" w:color="000000"/>
@@ -8408,7 +8408,7 @@
         </w:tc>
         <w:tc>
           <w:tcPr>
-            <w:tcW w:w="846" w:type="dxa"/>
+            <w:tcW w:w="850" w:type="dxa"/>
             <w:tcBorders>
               <w:top w:val="single" w:sz="4" w:space="0" w:color="000000"/>
               <w:left w:val="single" w:sz="4" w:space="0" w:color="000000"/>
@@ -8437,49 +8437,49 @@
         </w:tc>
         <w:tc>
           <w:tcPr>
-            <w:tcW w:w="987" w:type="dxa"/>
-            <w:tcBorders>
-              <w:top w:val="single" w:sz="4" w:space="0" w:color="000000"/>
-              <w:left w:val="single" w:sz="4" w:space="0" w:color="000000"/>
-              <w:bottom w:val="single" w:sz="4" w:space="0" w:color="000000"/>
-              <w:right w:val="single" w:sz="4" w:space="0" w:color="000000"/>
-            </w:tcBorders>
-            <w:vAlign w:val="center"/>
-          </w:tcPr>
-          <w:p>
-            <w:pPr>
-              <w:rPr>
-                <w:rFonts w:ascii="Times New Roman" w:hAnsi="Times New Roman" w:cs="Times New Roman"/>
-                <w:sz w:val="26"/>
-                <w:szCs w:val="26"/>
-              </w:rPr>
-            </w:pPr>
-          </w:p>
-        </w:tc>
-        <w:tc>
-          <w:tcPr>
-            <w:tcW w:w="1144" w:type="dxa"/>
-            <w:tcBorders>
-              <w:top w:val="single" w:sz="4" w:space="0" w:color="000000"/>
-              <w:left w:val="single" w:sz="4" w:space="0" w:color="000000"/>
-              <w:bottom w:val="single" w:sz="4" w:space="0" w:color="000000"/>
-              <w:right w:val="single" w:sz="4" w:space="0" w:color="000000"/>
-            </w:tcBorders>
-            <w:vAlign w:val="center"/>
-          </w:tcPr>
-          <w:p>
-            <w:pPr>
-              <w:rPr>
-                <w:rFonts w:ascii="Times New Roman" w:hAnsi="Times New Roman" w:cs="Times New Roman"/>
-                <w:sz w:val="26"/>
-                <w:szCs w:val="26"/>
-              </w:rPr>
-            </w:pPr>
-          </w:p>
-        </w:tc>
-        <w:tc>
-          <w:tcPr>
             <w:tcW w:w="709" w:type="dxa"/>
+            <w:tcBorders>
+              <w:top w:val="single" w:sz="4" w:space="0" w:color="000000"/>
+              <w:left w:val="single" w:sz="4" w:space="0" w:color="000000"/>
+              <w:bottom w:val="single" w:sz="4" w:space="0" w:color="000000"/>
+              <w:right w:val="single" w:sz="4" w:space="0" w:color="000000"/>
+            </w:tcBorders>
+            <w:vAlign w:val="center"/>
+          </w:tcPr>
+          <w:p>
+            <w:pPr>
+              <w:rPr>
+                <w:rFonts w:ascii="Times New Roman" w:hAnsi="Times New Roman" w:cs="Times New Roman"/>
+                <w:sz w:val="26"/>
+                <w:szCs w:val="26"/>
+              </w:rPr>
+            </w:pPr>
+          </w:p>
+        </w:tc>
+        <w:tc>
+          <w:tcPr>
+            <w:tcW w:w="1276" w:type="dxa"/>
+            <w:tcBorders>
+              <w:top w:val="single" w:sz="4" w:space="0" w:color="000000"/>
+              <w:left w:val="single" w:sz="4" w:space="0" w:color="000000"/>
+              <w:bottom w:val="single" w:sz="4" w:space="0" w:color="000000"/>
+              <w:right w:val="single" w:sz="4" w:space="0" w:color="000000"/>
+            </w:tcBorders>
+            <w:vAlign w:val="center"/>
+          </w:tcPr>
+          <w:p>
+            <w:pPr>
+              <w:rPr>
+                <w:rFonts w:ascii="Times New Roman" w:hAnsi="Times New Roman" w:cs="Times New Roman"/>
+                <w:sz w:val="26"/>
+                <w:szCs w:val="26"/>
+              </w:rPr>
+            </w:pPr>
+          </w:p>
+        </w:tc>
+        <w:tc>
+          <w:tcPr>
+            <w:tcW w:w="992" w:type="dxa"/>
             <w:tcBorders>
               <w:top w:val="single" w:sz="4" w:space="0" w:color="000000"/>
               <w:left w:val="single" w:sz="4" w:space="0" w:color="000000"/>
@@ -8547,7 +8547,7 @@
         </w:trPr>
         <w:tc>
           <w:tcPr>
-            <w:tcW w:w="1237" w:type="dxa"/>
+            <w:tcW w:w="1096" w:type="dxa"/>
             <w:vMerge w:val="restart"/>
             <w:tcBorders>
               <w:left w:val="single" w:sz="4" w:space="0" w:color="000000"/>
@@ -8575,7 +8575,7 @@
         </w:tc>
         <w:tc>
           <w:tcPr>
-            <w:tcW w:w="846" w:type="dxa"/>
+            <w:tcW w:w="850" w:type="dxa"/>
             <w:tcBorders>
               <w:top w:val="single" w:sz="4" w:space="0" w:color="000000"/>
               <w:left w:val="single" w:sz="4" w:space="0" w:color="000000"/>
@@ -8604,7 +8604,7 @@
         </w:tc>
         <w:tc>
           <w:tcPr>
-            <w:tcW w:w="987" w:type="dxa"/>
+            <w:tcW w:w="709" w:type="dxa"/>
             <w:tcBorders>
               <w:top w:val="single" w:sz="4" w:space="0" w:color="000000"/>
               <w:left w:val="single" w:sz="4" w:space="0" w:color="000000"/>
@@ -8633,7 +8633,7 @@
         </w:tc>
         <w:tc>
           <w:tcPr>
-            <w:tcW w:w="1144" w:type="dxa"/>
+            <w:tcW w:w="1276" w:type="dxa"/>
             <w:tcBorders>
               <w:top w:val="single" w:sz="4" w:space="0" w:color="000000"/>
               <w:left w:val="single" w:sz="4" w:space="0" w:color="000000"/>
@@ -8662,7 +8662,7 @@
         </w:tc>
         <w:tc>
           <w:tcPr>
-            <w:tcW w:w="709" w:type="dxa"/>
+            <w:tcW w:w="992" w:type="dxa"/>
             <w:tcBorders>
               <w:top w:val="single" w:sz="4" w:space="0" w:color="000000"/>
               <w:left w:val="single" w:sz="4" w:space="0" w:color="000000"/>
@@ -8754,7 +8754,7 @@
         </w:trPr>
         <w:tc>
           <w:tcPr>
-            <w:tcW w:w="1237" w:type="dxa"/>
+            <w:tcW w:w="1096" w:type="dxa"/>
             <w:vMerge/>
             <w:tcBorders>
               <w:left w:val="single" w:sz="4" w:space="0" w:color="000000"/>
@@ -8778,7 +8778,7 @@
         </w:tc>
         <w:tc>
           <w:tcPr>
-            <w:tcW w:w="846" w:type="dxa"/>
+            <w:tcW w:w="850" w:type="dxa"/>
             <w:tcBorders>
               <w:top w:val="single" w:sz="4" w:space="0" w:color="000000"/>
               <w:left w:val="single" w:sz="4" w:space="0" w:color="000000"/>
@@ -8807,7 +8807,7 @@
         </w:tc>
         <w:tc>
           <w:tcPr>
-            <w:tcW w:w="987" w:type="dxa"/>
+            <w:tcW w:w="709" w:type="dxa"/>
             <w:tcBorders>
               <w:top w:val="single" w:sz="4" w:space="0" w:color="000000"/>
               <w:left w:val="single" w:sz="4" w:space="0" w:color="000000"/>
@@ -8836,7 +8836,7 @@
         </w:tc>
         <w:tc>
           <w:tcPr>
-            <w:tcW w:w="1144" w:type="dxa"/>
+            <w:tcW w:w="1276" w:type="dxa"/>
             <w:tcBorders>
               <w:top w:val="single" w:sz="4" w:space="0" w:color="000000"/>
               <w:left w:val="single" w:sz="4" w:space="0" w:color="000000"/>
@@ -8865,7 +8865,7 @@
         </w:tc>
         <w:tc>
           <w:tcPr>
-            <w:tcW w:w="709" w:type="dxa"/>
+            <w:tcW w:w="992" w:type="dxa"/>
             <w:tcBorders>
               <w:top w:val="single" w:sz="4" w:space="0" w:color="000000"/>
               <w:left w:val="single" w:sz="4" w:space="0" w:color="000000"/>
@@ -8957,7 +8957,7 @@
         </w:trPr>
         <w:tc>
           <w:tcPr>
-            <w:tcW w:w="1237" w:type="dxa"/>
+            <w:tcW w:w="1096" w:type="dxa"/>
             <w:vMerge/>
             <w:tcBorders>
               <w:left w:val="single" w:sz="4" w:space="0" w:color="000000"/>
@@ -8981,7 +8981,7 @@
         </w:tc>
         <w:tc>
           <w:tcPr>
-            <w:tcW w:w="846" w:type="dxa"/>
+            <w:tcW w:w="850" w:type="dxa"/>
             <w:tcBorders>
               <w:top w:val="single" w:sz="4" w:space="0" w:color="000000"/>
               <w:left w:val="single" w:sz="4" w:space="0" w:color="000000"/>
@@ -9010,7 +9010,7 @@
         </w:tc>
         <w:tc>
           <w:tcPr>
-            <w:tcW w:w="987" w:type="dxa"/>
+            <w:tcW w:w="709" w:type="dxa"/>
             <w:tcBorders>
               <w:top w:val="single" w:sz="4" w:space="0" w:color="000000"/>
               <w:left w:val="single" w:sz="4" w:space="0" w:color="000000"/>
@@ -9039,7 +9039,7 @@
         </w:tc>
         <w:tc>
           <w:tcPr>
-            <w:tcW w:w="1144" w:type="dxa"/>
+            <w:tcW w:w="1276" w:type="dxa"/>
             <w:tcBorders>
               <w:top w:val="single" w:sz="4" w:space="0" w:color="000000"/>
               <w:left w:val="single" w:sz="4" w:space="0" w:color="000000"/>
@@ -9068,7 +9068,7 @@
         </w:tc>
         <w:tc>
           <w:tcPr>
-            <w:tcW w:w="709" w:type="dxa"/>
+            <w:tcW w:w="992" w:type="dxa"/>
             <w:tcBorders>
               <w:top w:val="single" w:sz="4" w:space="0" w:color="000000"/>
               <w:left w:val="single" w:sz="4" w:space="0" w:color="000000"/>
@@ -9160,7 +9160,7 @@
         </w:trPr>
         <w:tc>
           <w:tcPr>
-            <w:tcW w:w="1237" w:type="dxa"/>
+            <w:tcW w:w="1096" w:type="dxa"/>
             <w:vMerge/>
             <w:tcBorders>
               <w:left w:val="single" w:sz="4" w:space="0" w:color="000000"/>
@@ -9184,7 +9184,7 @@
         </w:tc>
         <w:tc>
           <w:tcPr>
-            <w:tcW w:w="846" w:type="dxa"/>
+            <w:tcW w:w="850" w:type="dxa"/>
             <w:tcBorders>
               <w:top w:val="single" w:sz="4" w:space="0" w:color="000000"/>
               <w:left w:val="single" w:sz="4" w:space="0" w:color="000000"/>
@@ -9213,7 +9213,7 @@
         </w:tc>
         <w:tc>
           <w:tcPr>
-            <w:tcW w:w="987" w:type="dxa"/>
+            <w:tcW w:w="709" w:type="dxa"/>
             <w:tcBorders>
               <w:top w:val="single" w:sz="4" w:space="0" w:color="000000"/>
               <w:left w:val="single" w:sz="4" w:space="0" w:color="000000"/>
@@ -9242,7 +9242,7 @@
         </w:tc>
         <w:tc>
           <w:tcPr>
-            <w:tcW w:w="1144" w:type="dxa"/>
+            <w:tcW w:w="1276" w:type="dxa"/>
             <w:tcBorders>
               <w:top w:val="single" w:sz="4" w:space="0" w:color="000000"/>
               <w:left w:val="single" w:sz="4" w:space="0" w:color="000000"/>
@@ -9271,7 +9271,7 @@
         </w:tc>
         <w:tc>
           <w:tcPr>
-            <w:tcW w:w="709" w:type="dxa"/>
+            <w:tcW w:w="992" w:type="dxa"/>
             <w:tcBorders>
               <w:top w:val="single" w:sz="4" w:space="0" w:color="000000"/>
               <w:left w:val="single" w:sz="4" w:space="0" w:color="000000"/>
@@ -9363,7 +9363,7 @@
         </w:trPr>
         <w:tc>
           <w:tcPr>
-            <w:tcW w:w="1237" w:type="dxa"/>
+            <w:tcW w:w="1096" w:type="dxa"/>
             <w:vMerge/>
             <w:tcBorders>
               <w:left w:val="single" w:sz="4" w:space="0" w:color="000000"/>
@@ -9387,7 +9387,7 @@
         </w:tc>
         <w:tc>
           <w:tcPr>
-            <w:tcW w:w="846" w:type="dxa"/>
+            <w:tcW w:w="850" w:type="dxa"/>
             <w:tcBorders>
               <w:top w:val="single" w:sz="4" w:space="0" w:color="000000"/>
               <w:left w:val="single" w:sz="4" w:space="0" w:color="000000"/>
@@ -9416,49 +9416,49 @@
         </w:tc>
         <w:tc>
           <w:tcPr>
-            <w:tcW w:w="987" w:type="dxa"/>
-            <w:tcBorders>
-              <w:top w:val="single" w:sz="4" w:space="0" w:color="000000"/>
-              <w:left w:val="single" w:sz="4" w:space="0" w:color="000000"/>
-              <w:bottom w:val="single" w:sz="4" w:space="0" w:color="000000"/>
-              <w:right w:val="single" w:sz="4" w:space="0" w:color="000000"/>
-            </w:tcBorders>
-            <w:vAlign w:val="center"/>
-          </w:tcPr>
-          <w:p>
-            <w:pPr>
-              <w:rPr>
-                <w:rFonts w:ascii="Times New Roman" w:hAnsi="Times New Roman" w:cs="Times New Roman"/>
-                <w:sz w:val="26"/>
-                <w:szCs w:val="26"/>
-              </w:rPr>
-            </w:pPr>
-          </w:p>
-        </w:tc>
-        <w:tc>
-          <w:tcPr>
-            <w:tcW w:w="1144" w:type="dxa"/>
-            <w:tcBorders>
-              <w:top w:val="single" w:sz="4" w:space="0" w:color="000000"/>
-              <w:left w:val="single" w:sz="4" w:space="0" w:color="000000"/>
-              <w:bottom w:val="single" w:sz="4" w:space="0" w:color="000000"/>
-              <w:right w:val="single" w:sz="4" w:space="0" w:color="000000"/>
-            </w:tcBorders>
-            <w:vAlign w:val="center"/>
-          </w:tcPr>
-          <w:p>
-            <w:pPr>
-              <w:rPr>
-                <w:rFonts w:ascii="Times New Roman" w:hAnsi="Times New Roman" w:cs="Times New Roman"/>
-                <w:sz w:val="26"/>
-                <w:szCs w:val="26"/>
-              </w:rPr>
-            </w:pPr>
-          </w:p>
-        </w:tc>
-        <w:tc>
-          <w:tcPr>
             <w:tcW w:w="709" w:type="dxa"/>
+            <w:tcBorders>
+              <w:top w:val="single" w:sz="4" w:space="0" w:color="000000"/>
+              <w:left w:val="single" w:sz="4" w:space="0" w:color="000000"/>
+              <w:bottom w:val="single" w:sz="4" w:space="0" w:color="000000"/>
+              <w:right w:val="single" w:sz="4" w:space="0" w:color="000000"/>
+            </w:tcBorders>
+            <w:vAlign w:val="center"/>
+          </w:tcPr>
+          <w:p>
+            <w:pPr>
+              <w:rPr>
+                <w:rFonts w:ascii="Times New Roman" w:hAnsi="Times New Roman" w:cs="Times New Roman"/>
+                <w:sz w:val="26"/>
+                <w:szCs w:val="26"/>
+              </w:rPr>
+            </w:pPr>
+          </w:p>
+        </w:tc>
+        <w:tc>
+          <w:tcPr>
+            <w:tcW w:w="1276" w:type="dxa"/>
+            <w:tcBorders>
+              <w:top w:val="single" w:sz="4" w:space="0" w:color="000000"/>
+              <w:left w:val="single" w:sz="4" w:space="0" w:color="000000"/>
+              <w:bottom w:val="single" w:sz="4" w:space="0" w:color="000000"/>
+              <w:right w:val="single" w:sz="4" w:space="0" w:color="000000"/>
+            </w:tcBorders>
+            <w:vAlign w:val="center"/>
+          </w:tcPr>
+          <w:p>
+            <w:pPr>
+              <w:rPr>
+                <w:rFonts w:ascii="Times New Roman" w:hAnsi="Times New Roman" w:cs="Times New Roman"/>
+                <w:sz w:val="26"/>
+                <w:szCs w:val="26"/>
+              </w:rPr>
+            </w:pPr>
+          </w:p>
+        </w:tc>
+        <w:tc>
+          <w:tcPr>
+            <w:tcW w:w="992" w:type="dxa"/>
             <w:tcBorders>
               <w:top w:val="single" w:sz="4" w:space="0" w:color="000000"/>
               <w:left w:val="single" w:sz="4" w:space="0" w:color="000000"/>
@@ -9526,7 +9526,7 @@
         </w:trPr>
         <w:tc>
           <w:tcPr>
-            <w:tcW w:w="1237" w:type="dxa"/>
+            <w:tcW w:w="1096" w:type="dxa"/>
             <w:vMerge w:val="restart"/>
             <w:tcBorders>
               <w:left w:val="single" w:sz="4" w:space="0" w:color="000000"/>
@@ -9554,7 +9554,7 @@
         </w:tc>
         <w:tc>
           <w:tcPr>
-            <w:tcW w:w="846" w:type="dxa"/>
+            <w:tcW w:w="850" w:type="dxa"/>
             <w:tcBorders>
               <w:top w:val="single" w:sz="4" w:space="0" w:color="000000"/>
               <w:left w:val="single" w:sz="4" w:space="0" w:color="000000"/>
@@ -9583,7 +9583,7 @@
         </w:tc>
         <w:tc>
           <w:tcPr>
-            <w:tcW w:w="987" w:type="dxa"/>
+            <w:tcW w:w="709" w:type="dxa"/>
             <w:tcBorders>
               <w:top w:val="single" w:sz="4" w:space="0" w:color="000000"/>
               <w:left w:val="single" w:sz="4" w:space="0" w:color="000000"/>
@@ -9612,7 +9612,7 @@
         </w:tc>
         <w:tc>
           <w:tcPr>
-            <w:tcW w:w="1144" w:type="dxa"/>
+            <w:tcW w:w="1276" w:type="dxa"/>
             <w:tcBorders>
               <w:top w:val="single" w:sz="4" w:space="0" w:color="000000"/>
               <w:left w:val="single" w:sz="4" w:space="0" w:color="000000"/>
@@ -9641,7 +9641,7 @@
         </w:tc>
         <w:tc>
           <w:tcPr>
-            <w:tcW w:w="709" w:type="dxa"/>
+            <w:tcW w:w="992" w:type="dxa"/>
             <w:tcBorders>
               <w:top w:val="single" w:sz="4" w:space="0" w:color="000000"/>
               <w:left w:val="single" w:sz="4" w:space="0" w:color="000000"/>
@@ -9733,7 +9733,7 @@
         </w:trPr>
         <w:tc>
           <w:tcPr>
-            <w:tcW w:w="1237" w:type="dxa"/>
+            <w:tcW w:w="1096" w:type="dxa"/>
             <w:vMerge/>
             <w:tcBorders>
               <w:left w:val="single" w:sz="4" w:space="0" w:color="000000"/>
@@ -9754,7 +9754,7 @@
         </w:tc>
         <w:tc>
           <w:tcPr>
-            <w:tcW w:w="846" w:type="dxa"/>
+            <w:tcW w:w="850" w:type="dxa"/>
             <w:tcBorders>
               <w:top w:val="single" w:sz="4" w:space="0" w:color="000000"/>
               <w:left w:val="single" w:sz="4" w:space="0" w:color="000000"/>
@@ -9783,7 +9783,7 @@
         </w:tc>
         <w:tc>
           <w:tcPr>
-            <w:tcW w:w="987" w:type="dxa"/>
+            <w:tcW w:w="709" w:type="dxa"/>
             <w:tcBorders>
               <w:top w:val="single" w:sz="4" w:space="0" w:color="000000"/>
               <w:left w:val="single" w:sz="4" w:space="0" w:color="000000"/>
@@ -9812,7 +9812,7 @@
         </w:tc>
         <w:tc>
           <w:tcPr>
-            <w:tcW w:w="1144" w:type="dxa"/>
+            <w:tcW w:w="1276" w:type="dxa"/>
             <w:tcBorders>
               <w:top w:val="single" w:sz="4" w:space="0" w:color="000000"/>
               <w:left w:val="single" w:sz="4" w:space="0" w:color="000000"/>
@@ -9841,7 +9841,7 @@
         </w:tc>
         <w:tc>
           <w:tcPr>
-            <w:tcW w:w="709" w:type="dxa"/>
+            <w:tcW w:w="992" w:type="dxa"/>
             <w:tcBorders>
               <w:top w:val="single" w:sz="4" w:space="0" w:color="000000"/>
               <w:left w:val="single" w:sz="4" w:space="0" w:color="000000"/>
@@ -9933,7 +9933,7 @@
         </w:trPr>
         <w:tc>
           <w:tcPr>
-            <w:tcW w:w="1237" w:type="dxa"/>
+            <w:tcW w:w="1096" w:type="dxa"/>
             <w:vMerge/>
             <w:tcBorders>
               <w:left w:val="single" w:sz="4" w:space="0" w:color="000000"/>
@@ -9954,7 +9954,7 @@
         </w:tc>
         <w:tc>
           <w:tcPr>
-            <w:tcW w:w="846" w:type="dxa"/>
+            <w:tcW w:w="850" w:type="dxa"/>
             <w:tcBorders>
               <w:top w:val="single" w:sz="4" w:space="0" w:color="000000"/>
               <w:left w:val="single" w:sz="4" w:space="0" w:color="000000"/>
@@ -9983,7 +9983,7 @@
         </w:tc>
         <w:tc>
           <w:tcPr>
-            <w:tcW w:w="987" w:type="dxa"/>
+            <w:tcW w:w="709" w:type="dxa"/>
             <w:tcBorders>
               <w:top w:val="single" w:sz="4" w:space="0" w:color="000000"/>
               <w:left w:val="single" w:sz="4" w:space="0" w:color="000000"/>
@@ -10012,7 +10012,7 @@
         </w:tc>
         <w:tc>
           <w:tcPr>
-            <w:tcW w:w="1144" w:type="dxa"/>
+            <w:tcW w:w="1276" w:type="dxa"/>
             <w:tcBorders>
               <w:top w:val="single" w:sz="4" w:space="0" w:color="000000"/>
               <w:left w:val="single" w:sz="4" w:space="0" w:color="000000"/>
@@ -10041,7 +10041,7 @@
         </w:tc>
         <w:tc>
           <w:tcPr>
-            <w:tcW w:w="709" w:type="dxa"/>
+            <w:tcW w:w="992" w:type="dxa"/>
             <w:tcBorders>
               <w:top w:val="single" w:sz="4" w:space="0" w:color="000000"/>
               <w:left w:val="single" w:sz="4" w:space="0" w:color="000000"/>
@@ -10133,7 +10133,7 @@
         </w:trPr>
         <w:tc>
           <w:tcPr>
-            <w:tcW w:w="1237" w:type="dxa"/>
+            <w:tcW w:w="1096" w:type="dxa"/>
             <w:vMerge/>
             <w:tcBorders>
               <w:left w:val="single" w:sz="4" w:space="0" w:color="000000"/>
@@ -10154,7 +10154,7 @@
         </w:tc>
         <w:tc>
           <w:tcPr>
-            <w:tcW w:w="846" w:type="dxa"/>
+            <w:tcW w:w="850" w:type="dxa"/>
             <w:tcBorders>
               <w:top w:val="single" w:sz="4" w:space="0" w:color="000000"/>
               <w:left w:val="single" w:sz="4" w:space="0" w:color="000000"/>
@@ -10183,49 +10183,49 @@
         </w:tc>
         <w:tc>
           <w:tcPr>
-            <w:tcW w:w="987" w:type="dxa"/>
-            <w:tcBorders>
-              <w:top w:val="single" w:sz="4" w:space="0" w:color="000000"/>
-              <w:left w:val="single" w:sz="4" w:space="0" w:color="000000"/>
-              <w:bottom w:val="single" w:sz="4" w:space="0" w:color="000000"/>
-              <w:right w:val="single" w:sz="4" w:space="0" w:color="000000"/>
-            </w:tcBorders>
-            <w:vAlign w:val="center"/>
-          </w:tcPr>
-          <w:p>
-            <w:pPr>
-              <w:rPr>
-                <w:rFonts w:ascii="Times New Roman" w:hAnsi="Times New Roman" w:cs="Times New Roman"/>
-                <w:sz w:val="26"/>
-                <w:szCs w:val="26"/>
-              </w:rPr>
-            </w:pPr>
-          </w:p>
-        </w:tc>
-        <w:tc>
-          <w:tcPr>
-            <w:tcW w:w="1144" w:type="dxa"/>
-            <w:tcBorders>
-              <w:top w:val="single" w:sz="4" w:space="0" w:color="000000"/>
-              <w:left w:val="single" w:sz="4" w:space="0" w:color="000000"/>
-              <w:bottom w:val="single" w:sz="4" w:space="0" w:color="000000"/>
-              <w:right w:val="single" w:sz="4" w:space="0" w:color="000000"/>
-            </w:tcBorders>
-            <w:vAlign w:val="center"/>
-          </w:tcPr>
-          <w:p>
-            <w:pPr>
-              <w:rPr>
-                <w:rFonts w:ascii="Times New Roman" w:hAnsi="Times New Roman" w:cs="Times New Roman"/>
-                <w:sz w:val="26"/>
-                <w:szCs w:val="26"/>
-              </w:rPr>
-            </w:pPr>
-          </w:p>
-        </w:tc>
-        <w:tc>
-          <w:tcPr>
             <w:tcW w:w="709" w:type="dxa"/>
+            <w:tcBorders>
+              <w:top w:val="single" w:sz="4" w:space="0" w:color="000000"/>
+              <w:left w:val="single" w:sz="4" w:space="0" w:color="000000"/>
+              <w:bottom w:val="single" w:sz="4" w:space="0" w:color="000000"/>
+              <w:right w:val="single" w:sz="4" w:space="0" w:color="000000"/>
+            </w:tcBorders>
+            <w:vAlign w:val="center"/>
+          </w:tcPr>
+          <w:p>
+            <w:pPr>
+              <w:rPr>
+                <w:rFonts w:ascii="Times New Roman" w:hAnsi="Times New Roman" w:cs="Times New Roman"/>
+                <w:sz w:val="26"/>
+                <w:szCs w:val="26"/>
+              </w:rPr>
+            </w:pPr>
+          </w:p>
+        </w:tc>
+        <w:tc>
+          <w:tcPr>
+            <w:tcW w:w="1276" w:type="dxa"/>
+            <w:tcBorders>
+              <w:top w:val="single" w:sz="4" w:space="0" w:color="000000"/>
+              <w:left w:val="single" w:sz="4" w:space="0" w:color="000000"/>
+              <w:bottom w:val="single" w:sz="4" w:space="0" w:color="000000"/>
+              <w:right w:val="single" w:sz="4" w:space="0" w:color="000000"/>
+            </w:tcBorders>
+            <w:vAlign w:val="center"/>
+          </w:tcPr>
+          <w:p>
+            <w:pPr>
+              <w:rPr>
+                <w:rFonts w:ascii="Times New Roman" w:hAnsi="Times New Roman" w:cs="Times New Roman"/>
+                <w:sz w:val="26"/>
+                <w:szCs w:val="26"/>
+              </w:rPr>
+            </w:pPr>
+          </w:p>
+        </w:tc>
+        <w:tc>
+          <w:tcPr>
+            <w:tcW w:w="992" w:type="dxa"/>
             <w:tcBorders>
               <w:top w:val="single" w:sz="4" w:space="0" w:color="000000"/>
               <w:left w:val="single" w:sz="4" w:space="0" w:color="000000"/>
@@ -10293,7 +10293,7 @@
         </w:trPr>
         <w:tc>
           <w:tcPr>
-            <w:tcW w:w="1237" w:type="dxa"/>
+            <w:tcW w:w="1096" w:type="dxa"/>
             <w:vMerge/>
             <w:tcBorders>
               <w:left w:val="single" w:sz="4" w:space="0" w:color="000000"/>
@@ -10314,7 +10314,7 @@
         </w:tc>
         <w:tc>
           <w:tcPr>
-            <w:tcW w:w="846" w:type="dxa"/>
+            <w:tcW w:w="850" w:type="dxa"/>
             <w:tcBorders>
               <w:top w:val="single" w:sz="4" w:space="0" w:color="000000"/>
               <w:left w:val="single" w:sz="4" w:space="0" w:color="000000"/>
@@ -10343,49 +10343,49 @@
         </w:tc>
         <w:tc>
           <w:tcPr>
-            <w:tcW w:w="987" w:type="dxa"/>
-            <w:tcBorders>
-              <w:top w:val="single" w:sz="4" w:space="0" w:color="000000"/>
-              <w:left w:val="single" w:sz="4" w:space="0" w:color="000000"/>
-              <w:bottom w:val="single" w:sz="4" w:space="0" w:color="000000"/>
-              <w:right w:val="single" w:sz="4" w:space="0" w:color="000000"/>
-            </w:tcBorders>
-            <w:vAlign w:val="center"/>
-          </w:tcPr>
-          <w:p>
-            <w:pPr>
-              <w:rPr>
-                <w:rFonts w:ascii="Times New Roman" w:hAnsi="Times New Roman" w:cs="Times New Roman"/>
-                <w:sz w:val="26"/>
-                <w:szCs w:val="26"/>
-              </w:rPr>
-            </w:pPr>
-          </w:p>
-        </w:tc>
-        <w:tc>
-          <w:tcPr>
-            <w:tcW w:w="1144" w:type="dxa"/>
-            <w:tcBorders>
-              <w:top w:val="single" w:sz="4" w:space="0" w:color="000000"/>
-              <w:left w:val="single" w:sz="4" w:space="0" w:color="000000"/>
-              <w:bottom w:val="single" w:sz="4" w:space="0" w:color="000000"/>
-              <w:right w:val="single" w:sz="4" w:space="0" w:color="000000"/>
-            </w:tcBorders>
-            <w:vAlign w:val="center"/>
-          </w:tcPr>
-          <w:p>
-            <w:pPr>
-              <w:rPr>
-                <w:rFonts w:ascii="Times New Roman" w:hAnsi="Times New Roman" w:cs="Times New Roman"/>
-                <w:sz w:val="26"/>
-                <w:szCs w:val="26"/>
-              </w:rPr>
-            </w:pPr>
-          </w:p>
-        </w:tc>
-        <w:tc>
-          <w:tcPr>
             <w:tcW w:w="709" w:type="dxa"/>
+            <w:tcBorders>
+              <w:top w:val="single" w:sz="4" w:space="0" w:color="000000"/>
+              <w:left w:val="single" w:sz="4" w:space="0" w:color="000000"/>
+              <w:bottom w:val="single" w:sz="4" w:space="0" w:color="000000"/>
+              <w:right w:val="single" w:sz="4" w:space="0" w:color="000000"/>
+            </w:tcBorders>
+            <w:vAlign w:val="center"/>
+          </w:tcPr>
+          <w:p>
+            <w:pPr>
+              <w:rPr>
+                <w:rFonts w:ascii="Times New Roman" w:hAnsi="Times New Roman" w:cs="Times New Roman"/>
+                <w:sz w:val="26"/>
+                <w:szCs w:val="26"/>
+              </w:rPr>
+            </w:pPr>
+          </w:p>
+        </w:tc>
+        <w:tc>
+          <w:tcPr>
+            <w:tcW w:w="1276" w:type="dxa"/>
+            <w:tcBorders>
+              <w:top w:val="single" w:sz="4" w:space="0" w:color="000000"/>
+              <w:left w:val="single" w:sz="4" w:space="0" w:color="000000"/>
+              <w:bottom w:val="single" w:sz="4" w:space="0" w:color="000000"/>
+              <w:right w:val="single" w:sz="4" w:space="0" w:color="000000"/>
+            </w:tcBorders>
+            <w:vAlign w:val="center"/>
+          </w:tcPr>
+          <w:p>
+            <w:pPr>
+              <w:rPr>
+                <w:rFonts w:ascii="Times New Roman" w:hAnsi="Times New Roman" w:cs="Times New Roman"/>
+                <w:sz w:val="26"/>
+                <w:szCs w:val="26"/>
+              </w:rPr>
+            </w:pPr>
+          </w:p>
+        </w:tc>
+        <w:tc>
+          <w:tcPr>
+            <w:tcW w:w="992" w:type="dxa"/>
             <w:tcBorders>
               <w:top w:val="single" w:sz="4" w:space="0" w:color="000000"/>
               <w:left w:val="single" w:sz="4" w:space="0" w:color="000000"/>
@@ -10647,7 +10647,6 @@
           <w:color w:val="000000"/>
           <w:szCs w:val="28"/>
         </w:rPr>
-        <w:lastRenderedPageBreak/>
         <w:t>Nhận xét của BGH hoặc tổ trưởng chuyên môn về tiến độ thực hiện chương trình</w:t>
       </w:r>
     </w:p>
@@ -10707,6 +10706,7 @@
                 <w:color w:val="000000"/>
                 <w:szCs w:val="26"/>
               </w:rPr>
+              <w:lastRenderedPageBreak/>
               <w:t>Ngày/tháng</w:t>
             </w:r>
           </w:p>

</xml_diff>

<commit_message>
Cập nhật Lịch báo giảng Tuần 30-35, slide bài giảng v3 Tin học (Tiền TH - Lớp 8) và các script hỗ trợ
</commit_message>
<xml_diff>
--- a/Hệ thống mẫu văn bản/Nguyên đã làm/Lịch báo giảng/Lịch báo giảng - Tuần 01.docx
+++ b/Hệ thống mẫu văn bản/Nguyên đã làm/Lịch báo giảng/Lịch báo giảng - Tuần 01.docx
@@ -808,6 +808,7 @@
                 <w:szCs w:val="26"/>
               </w:rPr>
             </w:pPr>
+            <w:r/>
           </w:p>
         </w:tc>
         <w:tc>
@@ -829,6 +830,7 @@
                 <w:szCs w:val="26"/>
               </w:rPr>
             </w:pPr>
+            <w:r/>
           </w:p>
         </w:tc>
         <w:tc>
@@ -850,6 +852,7 @@
                 <w:szCs w:val="26"/>
               </w:rPr>
             </w:pPr>
+            <w:r/>
           </w:p>
         </w:tc>
         <w:tc>
@@ -871,6 +874,7 @@
                 <w:szCs w:val="26"/>
               </w:rPr>
             </w:pPr>
+            <w:r/>
           </w:p>
         </w:tc>
         <w:tc>
@@ -892,6 +896,7 @@
                 <w:szCs w:val="26"/>
               </w:rPr>
             </w:pPr>
+            <w:r/>
           </w:p>
         </w:tc>
       </w:tr>
@@ -969,6 +974,7 @@
                 <w:szCs w:val="26"/>
               </w:rPr>
             </w:pPr>
+            <w:r/>
           </w:p>
         </w:tc>
         <w:tc>
@@ -990,6 +996,7 @@
                 <w:szCs w:val="26"/>
               </w:rPr>
             </w:pPr>
+            <w:r/>
           </w:p>
         </w:tc>
         <w:tc>
@@ -1011,6 +1018,7 @@
                 <w:szCs w:val="26"/>
               </w:rPr>
             </w:pPr>
+            <w:r/>
           </w:p>
         </w:tc>
         <w:tc>
@@ -1032,6 +1040,7 @@
                 <w:szCs w:val="26"/>
               </w:rPr>
             </w:pPr>
+            <w:r/>
           </w:p>
         </w:tc>
         <w:tc>
@@ -1053,6 +1062,7 @@
                 <w:szCs w:val="26"/>
               </w:rPr>
             </w:pPr>
+            <w:r/>
           </w:p>
         </w:tc>
       </w:tr>
@@ -1130,6 +1140,7 @@
                 <w:szCs w:val="26"/>
               </w:rPr>
             </w:pPr>
+            <w:r/>
           </w:p>
         </w:tc>
         <w:tc>
@@ -1151,6 +1162,7 @@
                 <w:szCs w:val="26"/>
               </w:rPr>
             </w:pPr>
+            <w:r/>
           </w:p>
         </w:tc>
         <w:tc>
@@ -1172,6 +1184,7 @@
                 <w:szCs w:val="26"/>
               </w:rPr>
             </w:pPr>
+            <w:r/>
           </w:p>
         </w:tc>
         <w:tc>
@@ -1193,6 +1206,7 @@
                 <w:szCs w:val="26"/>
               </w:rPr>
             </w:pPr>
+            <w:r/>
           </w:p>
         </w:tc>
         <w:tc>
@@ -1214,6 +1228,7 @@
                 <w:szCs w:val="26"/>
               </w:rPr>
             </w:pPr>
+            <w:r/>
           </w:p>
         </w:tc>
       </w:tr>
@@ -1492,6 +1507,7 @@
                 <w:szCs w:val="26"/>
               </w:rPr>
             </w:pPr>
+            <w:r/>
           </w:p>
         </w:tc>
         <w:tc>
@@ -1513,6 +1529,7 @@
                 <w:szCs w:val="26"/>
               </w:rPr>
             </w:pPr>
+            <w:r/>
           </w:p>
         </w:tc>
         <w:tc>
@@ -1534,6 +1551,7 @@
                 <w:szCs w:val="26"/>
               </w:rPr>
             </w:pPr>
+            <w:r/>
           </w:p>
         </w:tc>
         <w:tc>
@@ -1555,6 +1573,7 @@
                 <w:szCs w:val="26"/>
               </w:rPr>
             </w:pPr>
+            <w:r/>
           </w:p>
         </w:tc>
         <w:tc>
@@ -1576,6 +1595,7 @@
                 <w:szCs w:val="26"/>
               </w:rPr>
             </w:pPr>
+            <w:r/>
           </w:p>
         </w:tc>
       </w:tr>
@@ -1659,6 +1679,9 @@
                 <w:szCs w:val="26"/>
               </w:rPr>
             </w:pPr>
+            <w:r>
+              <w:t>1</w:t>
+            </w:r>
           </w:p>
         </w:tc>
         <w:tc>
@@ -1680,6 +1703,9 @@
                 <w:szCs w:val="26"/>
               </w:rPr>
             </w:pPr>
+            <w:r>
+              <w:t>Tin học</w:t>
+            </w:r>
           </w:p>
         </w:tc>
         <w:tc>
@@ -1701,6 +1727,9 @@
                 <w:szCs w:val="26"/>
               </w:rPr>
             </w:pPr>
+            <w:r>
+              <w:t>1C1</w:t>
+            </w:r>
           </w:p>
         </w:tc>
         <w:tc>
@@ -1722,6 +1751,9 @@
                 <w:szCs w:val="26"/>
               </w:rPr>
             </w:pPr>
+            <w:r>
+              <w:t>Tiết 0: Định hướng môn học</w:t>
+            </w:r>
           </w:p>
         </w:tc>
         <w:tc>
@@ -1743,6 +1775,9 @@
                 <w:szCs w:val="26"/>
               </w:rPr>
             </w:pPr>
+            <w:r>
+              <w:t>Phòng Tin học</w:t>
+            </w:r>
           </w:p>
         </w:tc>
       </w:tr>
@@ -1822,6 +1857,7 @@
                 <w:szCs w:val="26"/>
               </w:rPr>
             </w:pPr>
+            <w:r/>
           </w:p>
         </w:tc>
         <w:tc>
@@ -1843,6 +1879,7 @@
                 <w:szCs w:val="26"/>
               </w:rPr>
             </w:pPr>
+            <w:r/>
           </w:p>
         </w:tc>
         <w:tc>
@@ -1864,6 +1901,7 @@
                 <w:szCs w:val="26"/>
               </w:rPr>
             </w:pPr>
+            <w:r/>
           </w:p>
         </w:tc>
         <w:tc>
@@ -1885,6 +1923,7 @@
                 <w:szCs w:val="26"/>
               </w:rPr>
             </w:pPr>
+            <w:r/>
           </w:p>
         </w:tc>
         <w:tc>
@@ -1906,6 +1945,7 @@
                 <w:szCs w:val="26"/>
               </w:rPr>
             </w:pPr>
+            <w:r/>
           </w:p>
         </w:tc>
       </w:tr>
@@ -2107,7 +2147,7 @@
                 <w:sz w:val="26"/>
                 <w:szCs w:val="26"/>
               </w:rPr>
-              <w:t>Bộ Kit Robotics</w:t>
+              <w:t>Phòng Tin học</w:t>
             </w:r>
           </w:p>
         </w:tc>
@@ -2391,6 +2431,7 @@
                 <w:szCs w:val="26"/>
               </w:rPr>
             </w:pPr>
+            <w:r/>
           </w:p>
         </w:tc>
         <w:tc>
@@ -2412,6 +2453,7 @@
                 <w:szCs w:val="26"/>
               </w:rPr>
             </w:pPr>
+            <w:r/>
           </w:p>
         </w:tc>
         <w:tc>
@@ -2433,6 +2475,7 @@
                 <w:szCs w:val="26"/>
               </w:rPr>
             </w:pPr>
+            <w:r/>
           </w:p>
         </w:tc>
         <w:tc>
@@ -2454,6 +2497,7 @@
                 <w:szCs w:val="26"/>
               </w:rPr>
             </w:pPr>
+            <w:r/>
           </w:p>
         </w:tc>
         <w:tc>
@@ -2475,6 +2519,7 @@
                 <w:szCs w:val="26"/>
               </w:rPr>
             </w:pPr>
+            <w:r/>
           </w:p>
         </w:tc>
       </w:tr>
@@ -2558,6 +2603,7 @@
                 <w:szCs w:val="26"/>
               </w:rPr>
             </w:pPr>
+            <w:r/>
           </w:p>
         </w:tc>
         <w:tc>
@@ -2579,6 +2625,7 @@
                 <w:szCs w:val="26"/>
               </w:rPr>
             </w:pPr>
+            <w:r/>
           </w:p>
         </w:tc>
         <w:tc>
@@ -2600,6 +2647,7 @@
                 <w:szCs w:val="26"/>
               </w:rPr>
             </w:pPr>
+            <w:r/>
           </w:p>
         </w:tc>
         <w:tc>
@@ -2621,6 +2669,7 @@
                 <w:szCs w:val="26"/>
               </w:rPr>
             </w:pPr>
+            <w:r/>
           </w:p>
         </w:tc>
         <w:tc>
@@ -2642,6 +2691,7 @@
                 <w:szCs w:val="26"/>
               </w:rPr>
             </w:pPr>
+            <w:r/>
           </w:p>
         </w:tc>
       </w:tr>
@@ -2924,6 +2974,7 @@
                 <w:szCs w:val="26"/>
               </w:rPr>
             </w:pPr>
+            <w:r/>
           </w:p>
         </w:tc>
         <w:tc>
@@ -2945,6 +2996,7 @@
                 <w:szCs w:val="26"/>
               </w:rPr>
             </w:pPr>
+            <w:r/>
           </w:p>
         </w:tc>
         <w:tc>
@@ -2966,6 +3018,7 @@
                 <w:szCs w:val="26"/>
               </w:rPr>
             </w:pPr>
+            <w:r/>
           </w:p>
         </w:tc>
         <w:tc>
@@ -2987,6 +3040,7 @@
                 <w:szCs w:val="26"/>
               </w:rPr>
             </w:pPr>
+            <w:r/>
           </w:p>
         </w:tc>
         <w:tc>
@@ -3008,6 +3062,7 @@
                 <w:szCs w:val="26"/>
               </w:rPr>
             </w:pPr>
+            <w:r/>
           </w:p>
         </w:tc>
       </w:tr>
@@ -3290,6 +3345,7 @@
                 <w:szCs w:val="26"/>
               </w:rPr>
             </w:pPr>
+            <w:r/>
           </w:p>
         </w:tc>
         <w:tc>
@@ -3311,6 +3367,7 @@
                 <w:szCs w:val="26"/>
               </w:rPr>
             </w:pPr>
+            <w:r/>
           </w:p>
         </w:tc>
         <w:tc>
@@ -3332,6 +3389,7 @@
                 <w:szCs w:val="26"/>
               </w:rPr>
             </w:pPr>
+            <w:r/>
           </w:p>
         </w:tc>
         <w:tc>
@@ -3353,6 +3411,7 @@
                 <w:szCs w:val="26"/>
               </w:rPr>
             </w:pPr>
+            <w:r/>
           </w:p>
         </w:tc>
         <w:tc>
@@ -3374,6 +3433,7 @@
                 <w:szCs w:val="26"/>
               </w:rPr>
             </w:pPr>
+            <w:r/>
           </w:p>
         </w:tc>
       </w:tr>
@@ -3863,6 +3923,7 @@
                 <w:szCs w:val="26"/>
               </w:rPr>
             </w:pPr>
+            <w:r/>
           </w:p>
         </w:tc>
         <w:tc>
@@ -3884,6 +3945,7 @@
                 <w:szCs w:val="26"/>
               </w:rPr>
             </w:pPr>
+            <w:r/>
           </w:p>
         </w:tc>
         <w:tc>
@@ -3905,6 +3967,7 @@
                 <w:szCs w:val="26"/>
               </w:rPr>
             </w:pPr>
+            <w:r/>
           </w:p>
         </w:tc>
         <w:tc>
@@ -3926,6 +3989,7 @@
                 <w:szCs w:val="26"/>
               </w:rPr>
             </w:pPr>
+            <w:r/>
           </w:p>
         </w:tc>
         <w:tc>
@@ -3947,6 +4011,7 @@
                 <w:szCs w:val="26"/>
               </w:rPr>
             </w:pPr>
+            <w:r/>
           </w:p>
         </w:tc>
       </w:tr>
@@ -4229,6 +4294,7 @@
                 <w:szCs w:val="26"/>
               </w:rPr>
             </w:pPr>
+            <w:r/>
           </w:p>
         </w:tc>
         <w:tc>
@@ -4250,6 +4316,7 @@
                 <w:szCs w:val="26"/>
               </w:rPr>
             </w:pPr>
+            <w:r/>
           </w:p>
         </w:tc>
         <w:tc>
@@ -4271,6 +4338,7 @@
                 <w:szCs w:val="26"/>
               </w:rPr>
             </w:pPr>
+            <w:r/>
           </w:p>
         </w:tc>
         <w:tc>
@@ -4292,6 +4360,7 @@
                 <w:szCs w:val="26"/>
               </w:rPr>
             </w:pPr>
+            <w:r/>
           </w:p>
         </w:tc>
         <w:tc>
@@ -4313,6 +4382,7 @@
                 <w:szCs w:val="26"/>
               </w:rPr>
             </w:pPr>
+            <w:r/>
           </w:p>
         </w:tc>
       </w:tr>
@@ -4396,6 +4466,9 @@
                 <w:szCs w:val="26"/>
               </w:rPr>
             </w:pPr>
+            <w:r>
+              <w:t>1</w:t>
+            </w:r>
           </w:p>
         </w:tc>
         <w:tc>
@@ -4417,6 +4490,9 @@
                 <w:szCs w:val="26"/>
               </w:rPr>
             </w:pPr>
+            <w:r>
+              <w:t>Robotics</w:t>
+            </w:r>
           </w:p>
         </w:tc>
         <w:tc>
@@ -4438,6 +4514,9 @@
                 <w:szCs w:val="26"/>
               </w:rPr>
             </w:pPr>
+            <w:r>
+              <w:t>3C1</w:t>
+            </w:r>
           </w:p>
         </w:tc>
         <w:tc>
@@ -4459,6 +4538,9 @@
                 <w:szCs w:val="26"/>
               </w:rPr>
             </w:pPr>
+            <w:r>
+              <w:t>Tiết 0: Định hướng môn học</w:t>
+            </w:r>
           </w:p>
         </w:tc>
         <w:tc>
@@ -4480,6 +4562,9 @@
                 <w:szCs w:val="26"/>
               </w:rPr>
             </w:pPr>
+            <w:r>
+              <w:t>Bộ Kit Robotics</w:t>
+            </w:r>
           </w:p>
         </w:tc>
       </w:tr>
@@ -4562,7 +4647,6 @@
                 <w:sz w:val="26"/>
                 <w:szCs w:val="26"/>
               </w:rPr>
-              <w:t>1</w:t>
             </w:r>
           </w:p>
         </w:tc>
@@ -4591,7 +4675,6 @@
                 <w:sz w:val="26"/>
                 <w:szCs w:val="26"/>
               </w:rPr>
-              <w:t>Robotics</w:t>
             </w:r>
           </w:p>
         </w:tc>
@@ -4620,7 +4703,6 @@
                 <w:sz w:val="26"/>
                 <w:szCs w:val="26"/>
               </w:rPr>
-              <w:t>3C1</w:t>
             </w:r>
           </w:p>
         </w:tc>
@@ -4649,7 +4731,6 @@
                 <w:sz w:val="26"/>
                 <w:szCs w:val="26"/>
               </w:rPr>
-              <w:t>Tiết 0: Định hướng môn học</w:t>
             </w:r>
           </w:p>
         </w:tc>
@@ -4678,7 +4759,6 @@
                 <w:sz w:val="26"/>
                 <w:szCs w:val="26"/>
               </w:rPr>
-              <w:t>Bộ Kit Robotics</w:t>
             </w:r>
           </w:p>
         </w:tc>
@@ -4762,7 +4842,6 @@
                 <w:sz w:val="26"/>
                 <w:szCs w:val="26"/>
               </w:rPr>
-              <w:t>1</w:t>
             </w:r>
           </w:p>
         </w:tc>
@@ -4791,7 +4870,6 @@
                 <w:sz w:val="26"/>
                 <w:szCs w:val="26"/>
               </w:rPr>
-              <w:t>Tin học</w:t>
             </w:r>
           </w:p>
         </w:tc>
@@ -4820,7 +4898,6 @@
                 <w:sz w:val="26"/>
                 <w:szCs w:val="26"/>
               </w:rPr>
-              <w:t>2C1</w:t>
             </w:r>
           </w:p>
         </w:tc>
@@ -4849,7 +4926,6 @@
                 <w:sz w:val="26"/>
                 <w:szCs w:val="26"/>
               </w:rPr>
-              <w:t>Tiết 0: Định hướng môn học</w:t>
             </w:r>
           </w:p>
         </w:tc>
@@ -4878,7 +4954,6 @@
                 <w:sz w:val="26"/>
                 <w:szCs w:val="26"/>
               </w:rPr>
-              <w:t>Phòng Tin học</w:t>
             </w:r>
           </w:p>
         </w:tc>
@@ -5078,7 +5153,7 @@
                 <w:sz w:val="26"/>
                 <w:szCs w:val="26"/>
               </w:rPr>
-              <w:t>Bộ Kit Robotics</w:t>
+              <w:t>Phòng Tin học</w:t>
             </w:r>
           </w:p>
         </w:tc>
@@ -5836,6 +5911,7 @@
                 <w:szCs w:val="26"/>
               </w:rPr>
             </w:pPr>
+            <w:r/>
           </w:p>
         </w:tc>
         <w:tc>
@@ -5857,6 +5933,7 @@
                 <w:szCs w:val="26"/>
               </w:rPr>
             </w:pPr>
+            <w:r/>
           </w:p>
         </w:tc>
         <w:tc>
@@ -5878,6 +5955,7 @@
                 <w:szCs w:val="26"/>
               </w:rPr>
             </w:pPr>
+            <w:r/>
           </w:p>
         </w:tc>
         <w:tc>
@@ -5899,6 +5977,7 @@
                 <w:szCs w:val="26"/>
               </w:rPr>
             </w:pPr>
+            <w:r/>
           </w:p>
         </w:tc>
         <w:tc>
@@ -5920,6 +5999,7 @@
                 <w:szCs w:val="26"/>
               </w:rPr>
             </w:pPr>
+            <w:r/>
           </w:p>
         </w:tc>
       </w:tr>
@@ -5997,6 +6077,7 @@
                 <w:szCs w:val="26"/>
               </w:rPr>
             </w:pPr>
+            <w:r/>
           </w:p>
         </w:tc>
         <w:tc>
@@ -6018,6 +6099,7 @@
                 <w:szCs w:val="26"/>
               </w:rPr>
             </w:pPr>
+            <w:r/>
           </w:p>
         </w:tc>
         <w:tc>
@@ -6039,6 +6121,7 @@
                 <w:szCs w:val="26"/>
               </w:rPr>
             </w:pPr>
+            <w:r/>
           </w:p>
         </w:tc>
         <w:tc>
@@ -6060,6 +6143,7 @@
                 <w:szCs w:val="26"/>
               </w:rPr>
             </w:pPr>
+            <w:r/>
           </w:p>
         </w:tc>
         <w:tc>
@@ -6081,6 +6165,7 @@
                 <w:szCs w:val="26"/>
               </w:rPr>
             </w:pPr>
+            <w:r/>
           </w:p>
         </w:tc>
       </w:tr>
@@ -6158,6 +6243,9 @@
                 <w:szCs w:val="26"/>
               </w:rPr>
             </w:pPr>
+            <w:r>
+              <w:t>1</w:t>
+            </w:r>
           </w:p>
         </w:tc>
         <w:tc>
@@ -6179,6 +6267,9 @@
                 <w:szCs w:val="26"/>
               </w:rPr>
             </w:pPr>
+            <w:r>
+              <w:t>Tin học</w:t>
+            </w:r>
           </w:p>
         </w:tc>
         <w:tc>
@@ -6200,6 +6291,9 @@
                 <w:szCs w:val="26"/>
               </w:rPr>
             </w:pPr>
+            <w:r>
+              <w:t>2C1</w:t>
+            </w:r>
           </w:p>
         </w:tc>
         <w:tc>
@@ -6221,6 +6315,9 @@
                 <w:szCs w:val="26"/>
               </w:rPr>
             </w:pPr>
+            <w:r>
+              <w:t>Tiết 0: Định hướng môn học</w:t>
+            </w:r>
           </w:p>
         </w:tc>
         <w:tc>
@@ -6242,6 +6339,9 @@
                 <w:szCs w:val="26"/>
               </w:rPr>
             </w:pPr>
+            <w:r>
+              <w:t>Phòng Tin học</w:t>
+            </w:r>
           </w:p>
         </w:tc>
       </w:tr>
@@ -6319,6 +6419,7 @@
                 <w:szCs w:val="26"/>
               </w:rPr>
             </w:pPr>
+            <w:r/>
           </w:p>
         </w:tc>
         <w:tc>
@@ -6340,6 +6441,7 @@
                 <w:szCs w:val="26"/>
               </w:rPr>
             </w:pPr>
+            <w:r/>
           </w:p>
         </w:tc>
         <w:tc>
@@ -6361,6 +6463,7 @@
                 <w:szCs w:val="26"/>
               </w:rPr>
             </w:pPr>
+            <w:r/>
           </w:p>
         </w:tc>
         <w:tc>
@@ -6382,6 +6485,7 @@
                 <w:szCs w:val="26"/>
               </w:rPr>
             </w:pPr>
+            <w:r/>
           </w:p>
         </w:tc>
         <w:tc>
@@ -6403,6 +6507,7 @@
                 <w:szCs w:val="26"/>
               </w:rPr>
             </w:pPr>
+            <w:r/>
           </w:p>
         </w:tc>
       </w:tr>
@@ -6480,6 +6585,7 @@
                 <w:szCs w:val="26"/>
               </w:rPr>
             </w:pPr>
+            <w:r/>
           </w:p>
         </w:tc>
         <w:tc>
@@ -6501,6 +6607,7 @@
                 <w:szCs w:val="26"/>
               </w:rPr>
             </w:pPr>
+            <w:r/>
           </w:p>
         </w:tc>
         <w:tc>
@@ -6522,6 +6629,7 @@
                 <w:szCs w:val="26"/>
               </w:rPr>
             </w:pPr>
+            <w:r/>
           </w:p>
         </w:tc>
         <w:tc>
@@ -6543,6 +6651,7 @@
                 <w:szCs w:val="26"/>
               </w:rPr>
             </w:pPr>
+            <w:r/>
           </w:p>
         </w:tc>
         <w:tc>
@@ -6564,6 +6673,7 @@
                 <w:szCs w:val="26"/>
               </w:rPr>
             </w:pPr>
+            <w:r/>
           </w:p>
         </w:tc>
       </w:tr>
@@ -6856,7 +6966,6 @@
                 <w:sz w:val="26"/>
                 <w:szCs w:val="26"/>
               </w:rPr>
-              <w:t>1</w:t>
             </w:r>
           </w:p>
         </w:tc>
@@ -6885,7 +6994,6 @@
                 <w:sz w:val="26"/>
                 <w:szCs w:val="26"/>
               </w:rPr>
-              <w:t>Tin học</w:t>
             </w:r>
           </w:p>
         </w:tc>
@@ -6914,7 +7022,6 @@
                 <w:sz w:val="26"/>
                 <w:szCs w:val="26"/>
               </w:rPr>
-              <w:t>1C1</w:t>
             </w:r>
           </w:p>
         </w:tc>
@@ -6943,7 +7050,6 @@
                 <w:sz w:val="26"/>
                 <w:szCs w:val="26"/>
               </w:rPr>
-              <w:t>Tiết 0: Định hướng môn học</w:t>
             </w:r>
           </w:p>
         </w:tc>
@@ -6972,7 +7078,6 @@
                 <w:sz w:val="26"/>
                 <w:szCs w:val="26"/>
               </w:rPr>
-              <w:t>Phòng Tin học</w:t>
             </w:r>
           </w:p>
         </w:tc>
@@ -7059,7 +7164,7 @@
                 <w:sz w:val="26"/>
                 <w:szCs w:val="26"/>
               </w:rPr>
-              <w:t>2</w:t>
+              <w:t>1</w:t>
             </w:r>
           </w:p>
         </w:tc>
@@ -7175,7 +7280,7 @@
                 <w:sz w:val="26"/>
                 <w:szCs w:val="26"/>
               </w:rPr>
-              <w:t>Bộ Kit Robotics</w:t>
+              <w:t>Phòng Tin học</w:t>
             </w:r>
           </w:p>
         </w:tc>
@@ -7459,6 +7564,7 @@
                 <w:szCs w:val="26"/>
               </w:rPr>
             </w:pPr>
+            <w:r/>
           </w:p>
         </w:tc>
         <w:tc>
@@ -7480,6 +7586,7 @@
                 <w:szCs w:val="26"/>
               </w:rPr>
             </w:pPr>
+            <w:r/>
           </w:p>
         </w:tc>
         <w:tc>
@@ -7501,6 +7608,7 @@
                 <w:szCs w:val="26"/>
               </w:rPr>
             </w:pPr>
+            <w:r/>
           </w:p>
         </w:tc>
         <w:tc>
@@ -7522,6 +7630,7 @@
                 <w:szCs w:val="26"/>
               </w:rPr>
             </w:pPr>
+            <w:r/>
           </w:p>
         </w:tc>
         <w:tc>
@@ -7543,6 +7652,7 @@
                 <w:szCs w:val="26"/>
               </w:rPr>
             </w:pPr>
+            <w:r/>
           </w:p>
         </w:tc>
       </w:tr>
@@ -7626,6 +7736,7 @@
                 <w:szCs w:val="26"/>
               </w:rPr>
             </w:pPr>
+            <w:r/>
           </w:p>
         </w:tc>
         <w:tc>
@@ -7647,6 +7758,7 @@
                 <w:szCs w:val="26"/>
               </w:rPr>
             </w:pPr>
+            <w:r/>
           </w:p>
         </w:tc>
         <w:tc>
@@ -7668,6 +7780,7 @@
                 <w:szCs w:val="26"/>
               </w:rPr>
             </w:pPr>
+            <w:r/>
           </w:p>
         </w:tc>
         <w:tc>
@@ -7689,6 +7802,7 @@
                 <w:szCs w:val="26"/>
               </w:rPr>
             </w:pPr>
+            <w:r/>
           </w:p>
         </w:tc>
         <w:tc>
@@ -7710,6 +7824,7 @@
                 <w:szCs w:val="26"/>
               </w:rPr>
             </w:pPr>
+            <w:r/>
           </w:p>
         </w:tc>
       </w:tr>
@@ -7789,6 +7904,7 @@
                 <w:szCs w:val="26"/>
               </w:rPr>
             </w:pPr>
+            <w:r/>
           </w:p>
         </w:tc>
         <w:tc>
@@ -7810,6 +7926,7 @@
                 <w:szCs w:val="26"/>
               </w:rPr>
             </w:pPr>
+            <w:r/>
           </w:p>
         </w:tc>
         <w:tc>
@@ -7831,6 +7948,7 @@
                 <w:szCs w:val="26"/>
               </w:rPr>
             </w:pPr>
+            <w:r/>
           </w:p>
         </w:tc>
         <w:tc>
@@ -7852,6 +7970,7 @@
                 <w:szCs w:val="26"/>
               </w:rPr>
             </w:pPr>
+            <w:r/>
           </w:p>
         </w:tc>
         <w:tc>
@@ -7873,6 +7992,7 @@
                 <w:szCs w:val="26"/>
               </w:rPr>
             </w:pPr>
+            <w:r/>
           </w:p>
         </w:tc>
       </w:tr>
@@ -8358,6 +8478,7 @@
                 <w:szCs w:val="26"/>
               </w:rPr>
             </w:pPr>
+            <w:r/>
           </w:p>
         </w:tc>
         <w:tc>
@@ -8379,6 +8500,7 @@
                 <w:szCs w:val="26"/>
               </w:rPr>
             </w:pPr>
+            <w:r/>
           </w:p>
         </w:tc>
         <w:tc>
@@ -8400,6 +8522,7 @@
                 <w:szCs w:val="26"/>
               </w:rPr>
             </w:pPr>
+            <w:r/>
           </w:p>
         </w:tc>
         <w:tc>
@@ -8421,6 +8544,7 @@
                 <w:szCs w:val="26"/>
               </w:rPr>
             </w:pPr>
+            <w:r/>
           </w:p>
         </w:tc>
         <w:tc>
@@ -8442,6 +8566,7 @@
                 <w:szCs w:val="26"/>
               </w:rPr>
             </w:pPr>
+            <w:r/>
           </w:p>
         </w:tc>
       </w:tr>
@@ -9337,6 +9462,7 @@
                 <w:szCs w:val="26"/>
               </w:rPr>
             </w:pPr>
+            <w:r/>
           </w:p>
         </w:tc>
         <w:tc>
@@ -9358,6 +9484,7 @@
                 <w:szCs w:val="26"/>
               </w:rPr>
             </w:pPr>
+            <w:r/>
           </w:p>
         </w:tc>
         <w:tc>
@@ -9379,6 +9506,7 @@
                 <w:szCs w:val="26"/>
               </w:rPr>
             </w:pPr>
+            <w:r/>
           </w:p>
         </w:tc>
         <w:tc>
@@ -9400,6 +9528,7 @@
                 <w:szCs w:val="26"/>
               </w:rPr>
             </w:pPr>
+            <w:r/>
           </w:p>
         </w:tc>
         <w:tc>
@@ -9421,6 +9550,7 @@
                 <w:szCs w:val="26"/>
               </w:rPr>
             </w:pPr>
+            <w:r/>
           </w:p>
         </w:tc>
       </w:tr>
@@ -9626,7 +9756,7 @@
                 <w:sz w:val="26"/>
                 <w:szCs w:val="26"/>
               </w:rPr>
-              <w:t>Bộ Kit Robotics</w:t>
+              <w:t>Phòng Tin học</w:t>
             </w:r>
           </w:p>
         </w:tc>
@@ -10104,6 +10234,7 @@
                 <w:szCs w:val="26"/>
               </w:rPr>
             </w:pPr>
+            <w:r/>
           </w:p>
         </w:tc>
         <w:tc>
@@ -10125,6 +10256,7 @@
                 <w:szCs w:val="26"/>
               </w:rPr>
             </w:pPr>
+            <w:r/>
           </w:p>
         </w:tc>
         <w:tc>
@@ -10146,6 +10278,7 @@
                 <w:szCs w:val="26"/>
               </w:rPr>
             </w:pPr>
+            <w:r/>
           </w:p>
         </w:tc>
         <w:tc>
@@ -10167,6 +10300,7 @@
                 <w:szCs w:val="26"/>
               </w:rPr>
             </w:pPr>
+            <w:r/>
           </w:p>
         </w:tc>
         <w:tc>
@@ -10188,6 +10322,7 @@
                 <w:szCs w:val="26"/>
               </w:rPr>
             </w:pPr>
+            <w:r/>
           </w:p>
         </w:tc>
       </w:tr>
@@ -10264,6 +10399,7 @@
                 <w:szCs w:val="26"/>
               </w:rPr>
             </w:pPr>
+            <w:r/>
           </w:p>
         </w:tc>
         <w:tc>
@@ -10285,6 +10421,7 @@
                 <w:szCs w:val="26"/>
               </w:rPr>
             </w:pPr>
+            <w:r/>
           </w:p>
         </w:tc>
         <w:tc>
@@ -10306,6 +10443,7 @@
                 <w:szCs w:val="26"/>
               </w:rPr>
             </w:pPr>
+            <w:r/>
           </w:p>
         </w:tc>
         <w:tc>
@@ -10327,6 +10465,7 @@
                 <w:szCs w:val="26"/>
               </w:rPr>
             </w:pPr>
+            <w:r/>
           </w:p>
         </w:tc>
         <w:tc>
@@ -10348,6 +10487,7 @@
                 <w:szCs w:val="26"/>
               </w:rPr>
             </w:pPr>
+            <w:r/>
           </w:p>
         </w:tc>
       </w:tr>
@@ -10945,6 +11085,7 @@
                 <w:szCs w:val="26"/>
               </w:rPr>
             </w:pPr>
+            <w:r/>
           </w:p>
         </w:tc>
         <w:tc>
@@ -10966,6 +11107,7 @@
                 <w:szCs w:val="26"/>
               </w:rPr>
             </w:pPr>
+            <w:r/>
           </w:p>
         </w:tc>
         <w:tc>
@@ -10987,6 +11129,7 @@
                 <w:szCs w:val="26"/>
               </w:rPr>
             </w:pPr>
+            <w:r/>
           </w:p>
         </w:tc>
         <w:tc>
@@ -11008,6 +11151,7 @@
                 <w:szCs w:val="26"/>
               </w:rPr>
             </w:pPr>
+            <w:r/>
           </w:p>
         </w:tc>
         <w:tc>
@@ -11029,6 +11173,7 @@
                 <w:szCs w:val="26"/>
               </w:rPr>
             </w:pPr>
+            <w:r/>
           </w:p>
         </w:tc>
       </w:tr>
@@ -11106,6 +11251,7 @@
                 <w:szCs w:val="26"/>
               </w:rPr>
             </w:pPr>
+            <w:r/>
           </w:p>
         </w:tc>
         <w:tc>
@@ -11127,6 +11273,7 @@
                 <w:szCs w:val="26"/>
               </w:rPr>
             </w:pPr>
+            <w:r/>
           </w:p>
         </w:tc>
         <w:tc>
@@ -11148,6 +11295,7 @@
                 <w:szCs w:val="26"/>
               </w:rPr>
             </w:pPr>
+            <w:r/>
           </w:p>
         </w:tc>
         <w:tc>
@@ -11169,6 +11317,7 @@
                 <w:szCs w:val="26"/>
               </w:rPr>
             </w:pPr>
+            <w:r/>
           </w:p>
         </w:tc>
         <w:tc>
@@ -11190,6 +11339,7 @@
                 <w:szCs w:val="26"/>
               </w:rPr>
             </w:pPr>
+            <w:r/>
           </w:p>
         </w:tc>
       </w:tr>
@@ -11267,6 +11417,7 @@
                 <w:szCs w:val="26"/>
               </w:rPr>
             </w:pPr>
+            <w:r/>
           </w:p>
         </w:tc>
         <w:tc>
@@ -11288,6 +11439,7 @@
                 <w:szCs w:val="26"/>
               </w:rPr>
             </w:pPr>
+            <w:r/>
           </w:p>
         </w:tc>
         <w:tc>
@@ -11309,6 +11461,7 @@
                 <w:szCs w:val="26"/>
               </w:rPr>
             </w:pPr>
+            <w:r/>
           </w:p>
         </w:tc>
         <w:tc>
@@ -11330,6 +11483,7 @@
                 <w:szCs w:val="26"/>
               </w:rPr>
             </w:pPr>
+            <w:r/>
           </w:p>
         </w:tc>
         <w:tc>
@@ -11351,6 +11505,7 @@
                 <w:szCs w:val="26"/>
               </w:rPr>
             </w:pPr>
+            <w:r/>
           </w:p>
         </w:tc>
       </w:tr>
@@ -11434,7 +11589,6 @@
                 <w:sz w:val="26"/>
                 <w:szCs w:val="26"/>
               </w:rPr>
-              <w:t>1</w:t>
             </w:r>
           </w:p>
         </w:tc>
@@ -11521,7 +11675,6 @@
                 <w:sz w:val="26"/>
                 <w:szCs w:val="26"/>
               </w:rPr>
-              <w:t>Em làm quen với thế giới công nghệ</w:t>
             </w:r>
           </w:p>
         </w:tc>
@@ -11629,6 +11782,7 @@
                 <w:szCs w:val="26"/>
               </w:rPr>
             </w:pPr>
+            <w:r/>
           </w:p>
         </w:tc>
         <w:tc>
@@ -11650,6 +11804,7 @@
                 <w:szCs w:val="26"/>
               </w:rPr>
             </w:pPr>
+            <w:r/>
           </w:p>
         </w:tc>
         <w:tc>
@@ -11671,6 +11826,7 @@
                 <w:szCs w:val="26"/>
               </w:rPr>
             </w:pPr>
+            <w:r/>
           </w:p>
         </w:tc>
         <w:tc>
@@ -11692,6 +11848,7 @@
                 <w:szCs w:val="26"/>
               </w:rPr>
             </w:pPr>
+            <w:r/>
           </w:p>
         </w:tc>
         <w:tc>
@@ -11713,6 +11870,7 @@
                 <w:szCs w:val="26"/>
               </w:rPr>
             </w:pPr>
+            <w:r/>
           </w:p>
         </w:tc>
       </w:tr>
@@ -11796,6 +11954,7 @@
                 <w:szCs w:val="26"/>
               </w:rPr>
             </w:pPr>
+            <w:r/>
           </w:p>
         </w:tc>
         <w:tc>
@@ -11817,6 +11976,9 @@
                 <w:szCs w:val="26"/>
               </w:rPr>
             </w:pPr>
+            <w:r>
+              <w:t>Tin học</w:t>
+            </w:r>
           </w:p>
         </w:tc>
         <w:tc>
@@ -11838,6 +12000,9 @@
                 <w:szCs w:val="26"/>
               </w:rPr>
             </w:pPr>
+            <w:r>
+              <w:t>1C1</w:t>
+            </w:r>
           </w:p>
         </w:tc>
         <w:tc>
@@ -11859,6 +12024,7 @@
                 <w:szCs w:val="26"/>
               </w:rPr>
             </w:pPr>
+            <w:r/>
           </w:p>
         </w:tc>
         <w:tc>
@@ -11880,6 +12046,9 @@
                 <w:szCs w:val="26"/>
               </w:rPr>
             </w:pPr>
+            <w:r>
+              <w:t>Phòng Tin học</w:t>
+            </w:r>
           </w:p>
         </w:tc>
       </w:tr>
@@ -11959,6 +12128,7 @@
                 <w:szCs w:val="26"/>
               </w:rPr>
             </w:pPr>
+            <w:r/>
           </w:p>
         </w:tc>
         <w:tc>
@@ -11980,6 +12150,7 @@
                 <w:szCs w:val="26"/>
               </w:rPr>
             </w:pPr>
+            <w:r/>
           </w:p>
         </w:tc>
         <w:tc>
@@ -12001,6 +12172,7 @@
                 <w:szCs w:val="26"/>
               </w:rPr>
             </w:pPr>
+            <w:r/>
           </w:p>
         </w:tc>
         <w:tc>
@@ -12022,6 +12194,7 @@
                 <w:szCs w:val="26"/>
               </w:rPr>
             </w:pPr>
+            <w:r/>
           </w:p>
         </w:tc>
         <w:tc>
@@ -12043,6 +12216,7 @@
                 <w:szCs w:val="26"/>
               </w:rPr>
             </w:pPr>
+            <w:r/>
           </w:p>
         </w:tc>
       </w:tr>
@@ -12128,7 +12302,6 @@
                 <w:sz w:val="26"/>
                 <w:szCs w:val="26"/>
               </w:rPr>
-              <w:t>1</w:t>
             </w:r>
           </w:p>
         </w:tc>
@@ -12215,7 +12388,6 @@
                 <w:sz w:val="26"/>
                 <w:szCs w:val="26"/>
               </w:rPr>
-              <w:t>Bài 1: Em có thể làm gì với máy tính?</w:t>
             </w:r>
           </w:p>
         </w:tc>
@@ -12244,7 +12416,7 @@
                 <w:sz w:val="26"/>
                 <w:szCs w:val="26"/>
               </w:rPr>
-              <w:t>Bộ Kit Robotics</w:t>
+              <w:t>Phòng Tin học</w:t>
             </w:r>
           </w:p>
         </w:tc>
@@ -12331,7 +12503,6 @@
                 <w:sz w:val="26"/>
                 <w:szCs w:val="26"/>
               </w:rPr>
-              <w:t>2</w:t>
             </w:r>
           </w:p>
         </w:tc>
@@ -12418,7 +12589,6 @@
                 <w:sz w:val="26"/>
                 <w:szCs w:val="26"/>
               </w:rPr>
-              <w:t>Bài 2: Tìm kiếm thông tin trên website</w:t>
             </w:r>
           </w:p>
         </w:tc>
@@ -12528,6 +12698,7 @@
                 <w:szCs w:val="26"/>
               </w:rPr>
             </w:pPr>
+            <w:r/>
           </w:p>
         </w:tc>
         <w:tc>
@@ -12549,6 +12720,7 @@
                 <w:szCs w:val="26"/>
               </w:rPr>
             </w:pPr>
+            <w:r/>
           </w:p>
         </w:tc>
         <w:tc>
@@ -12570,6 +12742,7 @@
                 <w:szCs w:val="26"/>
               </w:rPr>
             </w:pPr>
+            <w:r/>
           </w:p>
         </w:tc>
         <w:tc>
@@ -12591,6 +12764,7 @@
                 <w:szCs w:val="26"/>
               </w:rPr>
             </w:pPr>
+            <w:r/>
           </w:p>
         </w:tc>
         <w:tc>
@@ -12612,6 +12786,7 @@
                 <w:szCs w:val="26"/>
               </w:rPr>
             </w:pPr>
+            <w:r/>
           </w:p>
         </w:tc>
       </w:tr>
@@ -12695,6 +12870,7 @@
                 <w:szCs w:val="26"/>
               </w:rPr>
             </w:pPr>
+            <w:r/>
           </w:p>
         </w:tc>
         <w:tc>
@@ -12716,6 +12892,7 @@
                 <w:szCs w:val="26"/>
               </w:rPr>
             </w:pPr>
+            <w:r/>
           </w:p>
         </w:tc>
         <w:tc>
@@ -12737,6 +12914,7 @@
                 <w:szCs w:val="26"/>
               </w:rPr>
             </w:pPr>
+            <w:r/>
           </w:p>
         </w:tc>
         <w:tc>
@@ -12758,6 +12936,7 @@
                 <w:szCs w:val="26"/>
               </w:rPr>
             </w:pPr>
+            <w:r/>
           </w:p>
         </w:tc>
         <w:tc>
@@ -12779,6 +12958,7 @@
                 <w:szCs w:val="26"/>
               </w:rPr>
             </w:pPr>
+            <w:r/>
           </w:p>
         </w:tc>
       </w:tr>
@@ -12864,7 +13044,6 @@
                 <w:sz w:val="26"/>
                 <w:szCs w:val="26"/>
               </w:rPr>
-              <w:t>1</w:t>
             </w:r>
           </w:p>
         </w:tc>
@@ -12951,7 +13130,6 @@
                 <w:sz w:val="26"/>
                 <w:szCs w:val="26"/>
               </w:rPr>
-              <w:t>Bài 1. Hãy nấu những món ăn ngon</w:t>
             </w:r>
           </w:p>
         </w:tc>
@@ -13061,6 +13239,7 @@
                 <w:szCs w:val="26"/>
               </w:rPr>
             </w:pPr>
+            <w:r/>
           </w:p>
         </w:tc>
         <w:tc>
@@ -13082,6 +13261,7 @@
                 <w:szCs w:val="26"/>
               </w:rPr>
             </w:pPr>
+            <w:r/>
           </w:p>
         </w:tc>
         <w:tc>
@@ -13103,6 +13283,7 @@
                 <w:szCs w:val="26"/>
               </w:rPr>
             </w:pPr>
+            <w:r/>
           </w:p>
         </w:tc>
         <w:tc>
@@ -13124,6 +13305,7 @@
                 <w:szCs w:val="26"/>
               </w:rPr>
             </w:pPr>
+            <w:r/>
           </w:p>
         </w:tc>
         <w:tc>
@@ -13145,6 +13327,7 @@
                 <w:szCs w:val="26"/>
               </w:rPr>
             </w:pPr>
+            <w:r/>
           </w:p>
         </w:tc>
       </w:tr>
@@ -13230,7 +13413,6 @@
                 <w:sz w:val="26"/>
                 <w:szCs w:val="26"/>
               </w:rPr>
-              <w:t>1</w:t>
             </w:r>
           </w:p>
         </w:tc>
@@ -13317,7 +13499,6 @@
                 <w:sz w:val="26"/>
                 <w:szCs w:val="26"/>
               </w:rPr>
-              <w:t>Bài 1: Thông tin và quyết định</w:t>
             </w:r>
           </w:p>
         </w:tc>
@@ -13427,6 +13608,7 @@
                 <w:szCs w:val="26"/>
               </w:rPr>
             </w:pPr>
+            <w:r/>
           </w:p>
         </w:tc>
         <w:tc>
@@ -13448,6 +13630,7 @@
                 <w:szCs w:val="26"/>
               </w:rPr>
             </w:pPr>
+            <w:r/>
           </w:p>
         </w:tc>
         <w:tc>
@@ -13469,6 +13652,7 @@
                 <w:szCs w:val="26"/>
               </w:rPr>
             </w:pPr>
+            <w:r/>
           </w:p>
         </w:tc>
         <w:tc>
@@ -13490,6 +13674,7 @@
                 <w:szCs w:val="26"/>
               </w:rPr>
             </w:pPr>
+            <w:r/>
           </w:p>
         </w:tc>
         <w:tc>
@@ -13511,6 +13696,7 @@
                 <w:szCs w:val="26"/>
               </w:rPr>
             </w:pPr>
+            <w:r/>
           </w:p>
         </w:tc>
       </w:tr>
@@ -13600,7 +13786,6 @@
                 <w:sz w:val="26"/>
                 <w:szCs w:val="26"/>
               </w:rPr>
-              <w:t>1</w:t>
             </w:r>
           </w:p>
         </w:tc>
@@ -13687,7 +13872,6 @@
                 <w:sz w:val="26"/>
                 <w:szCs w:val="26"/>
               </w:rPr>
-              <w:t>Em làm quen với thế giới công nghệ</w:t>
             </w:r>
           </w:p>
         </w:tc>
@@ -13803,7 +13987,6 @@
                 <w:sz w:val="26"/>
                 <w:szCs w:val="26"/>
               </w:rPr>
-              <w:t>1</w:t>
             </w:r>
           </w:p>
         </w:tc>
@@ -13890,7 +14073,6 @@
                 <w:sz w:val="26"/>
                 <w:szCs w:val="26"/>
               </w:rPr>
-              <w:t>Bài 1. Tập thể dục nào!</w:t>
             </w:r>
           </w:p>
         </w:tc>
@@ -14000,6 +14182,7 @@
                 <w:szCs w:val="26"/>
               </w:rPr>
             </w:pPr>
+            <w:r/>
           </w:p>
         </w:tc>
         <w:tc>
@@ -14021,6 +14204,7 @@
                 <w:szCs w:val="26"/>
               </w:rPr>
             </w:pPr>
+            <w:r/>
           </w:p>
         </w:tc>
         <w:tc>
@@ -14042,6 +14226,7 @@
                 <w:szCs w:val="26"/>
               </w:rPr>
             </w:pPr>
+            <w:r/>
           </w:p>
         </w:tc>
         <w:tc>
@@ -14063,6 +14248,7 @@
                 <w:szCs w:val="26"/>
               </w:rPr>
             </w:pPr>
+            <w:r/>
           </w:p>
         </w:tc>
         <w:tc>
@@ -14084,6 +14270,7 @@
                 <w:szCs w:val="26"/>
               </w:rPr>
             </w:pPr>
+            <w:r/>
           </w:p>
         </w:tc>
       </w:tr>
@@ -14169,7 +14356,6 @@
                 <w:sz w:val="26"/>
                 <w:szCs w:val="26"/>
               </w:rPr>
-              <w:t>1</w:t>
             </w:r>
           </w:p>
         </w:tc>
@@ -14256,7 +14442,6 @@
                 <w:sz w:val="26"/>
                 <w:szCs w:val="26"/>
               </w:rPr>
-              <w:t>Bài 1. Hãy nấu những món ăn ngon</w:t>
             </w:r>
           </w:p>
         </w:tc>
@@ -14366,6 +14551,7 @@
                 <w:szCs w:val="26"/>
               </w:rPr>
             </w:pPr>
+            <w:r/>
           </w:p>
         </w:tc>
         <w:tc>
@@ -14387,6 +14573,7 @@
                 <w:szCs w:val="26"/>
               </w:rPr>
             </w:pPr>
+            <w:r/>
           </w:p>
         </w:tc>
         <w:tc>
@@ -14408,6 +14595,7 @@
                 <w:szCs w:val="26"/>
               </w:rPr>
             </w:pPr>
+            <w:r/>
           </w:p>
         </w:tc>
         <w:tc>
@@ -14429,6 +14617,7 @@
                 <w:szCs w:val="26"/>
               </w:rPr>
             </w:pPr>
+            <w:r/>
           </w:p>
         </w:tc>
         <w:tc>
@@ -14450,6 +14639,7 @@
                 <w:szCs w:val="26"/>
               </w:rPr>
             </w:pPr>
+            <w:r/>
           </w:p>
         </w:tc>
       </w:tr>
@@ -14533,6 +14723,7 @@
                 <w:szCs w:val="26"/>
               </w:rPr>
             </w:pPr>
+            <w:r/>
           </w:p>
         </w:tc>
         <w:tc>
@@ -14554,6 +14745,9 @@
                 <w:szCs w:val="26"/>
               </w:rPr>
             </w:pPr>
+            <w:r>
+              <w:t>Robotics</w:t>
+            </w:r>
           </w:p>
         </w:tc>
         <w:tc>
@@ -14575,6 +14769,9 @@
                 <w:szCs w:val="26"/>
               </w:rPr>
             </w:pPr>
+            <w:r>
+              <w:t>3C1</w:t>
+            </w:r>
           </w:p>
         </w:tc>
         <w:tc>
@@ -14596,6 +14793,7 @@
                 <w:szCs w:val="26"/>
               </w:rPr>
             </w:pPr>
+            <w:r/>
           </w:p>
         </w:tc>
         <w:tc>
@@ -14617,6 +14815,9 @@
                 <w:szCs w:val="26"/>
               </w:rPr>
             </w:pPr>
+            <w:r>
+              <w:t>Bộ Kit Robotics</w:t>
+            </w:r>
           </w:p>
         </w:tc>
       </w:tr>
@@ -14699,7 +14900,6 @@
                 <w:sz w:val="26"/>
                 <w:szCs w:val="26"/>
               </w:rPr>
-              <w:t>1</w:t>
             </w:r>
           </w:p>
         </w:tc>
@@ -14728,7 +14928,6 @@
                 <w:sz w:val="26"/>
                 <w:szCs w:val="26"/>
               </w:rPr>
-              <w:t>Robotics</w:t>
             </w:r>
           </w:p>
         </w:tc>
@@ -14757,7 +14956,6 @@
                 <w:sz w:val="26"/>
                 <w:szCs w:val="26"/>
               </w:rPr>
-              <w:t>3C1</w:t>
             </w:r>
           </w:p>
         </w:tc>
@@ -14786,7 +14984,6 @@
                 <w:sz w:val="26"/>
                 <w:szCs w:val="26"/>
               </w:rPr>
-              <w:t>Bài 1. Hãy nấu những món ăn ngon</w:t>
             </w:r>
           </w:p>
         </w:tc>
@@ -14815,7 +15012,6 @@
                 <w:sz w:val="26"/>
                 <w:szCs w:val="26"/>
               </w:rPr>
-              <w:t>Bộ Kit Robotics</w:t>
             </w:r>
           </w:p>
         </w:tc>
@@ -14899,7 +15095,6 @@
                 <w:sz w:val="26"/>
                 <w:szCs w:val="26"/>
               </w:rPr>
-              <w:t>1</w:t>
             </w:r>
           </w:p>
         </w:tc>
@@ -14928,7 +15123,6 @@
                 <w:sz w:val="26"/>
                 <w:szCs w:val="26"/>
               </w:rPr>
-              <w:t>Tin học</w:t>
             </w:r>
           </w:p>
         </w:tc>
@@ -14957,7 +15151,6 @@
                 <w:sz w:val="26"/>
                 <w:szCs w:val="26"/>
               </w:rPr>
-              <w:t>2C1</w:t>
             </w:r>
           </w:p>
         </w:tc>
@@ -14986,7 +15179,6 @@
                 <w:sz w:val="26"/>
                 <w:szCs w:val="26"/>
               </w:rPr>
-              <w:t>Em trở thành nhà sáng tạo số</w:t>
             </w:r>
           </w:p>
         </w:tc>
@@ -15015,7 +15207,6 @@
                 <w:sz w:val="26"/>
                 <w:szCs w:val="26"/>
               </w:rPr>
-              <w:t>Phòng Tin học</w:t>
             </w:r>
           </w:p>
         </w:tc>
@@ -15099,7 +15290,6 @@
                 <w:sz w:val="26"/>
                 <w:szCs w:val="26"/>
               </w:rPr>
-              <w:t>1</w:t>
             </w:r>
           </w:p>
         </w:tc>
@@ -15186,7 +15376,6 @@
                 <w:sz w:val="26"/>
                 <w:szCs w:val="26"/>
               </w:rPr>
-              <w:t>Bài 1. Thông tin và dữ liệu</w:t>
             </w:r>
           </w:p>
         </w:tc>
@@ -15215,7 +15404,7 @@
                 <w:sz w:val="26"/>
                 <w:szCs w:val="26"/>
               </w:rPr>
-              <w:t>Bộ Kit Robotics</w:t>
+              <w:t>Phòng Tin học</w:t>
             </w:r>
           </w:p>
         </w:tc>
@@ -15299,7 +15488,6 @@
                 <w:sz w:val="26"/>
                 <w:szCs w:val="26"/>
               </w:rPr>
-              <w:t>2</w:t>
             </w:r>
           </w:p>
         </w:tc>
@@ -15386,7 +15574,6 @@
                 <w:sz w:val="26"/>
                 <w:szCs w:val="26"/>
               </w:rPr>
-              <w:t>Bài 2. Xử lí thông tin</w:t>
             </w:r>
           </w:p>
         </w:tc>
@@ -15967,6 +16154,7 @@
                 <w:szCs w:val="26"/>
               </w:rPr>
             </w:pPr>
+            <w:r/>
           </w:p>
         </w:tc>
         <w:tc>
@@ -15988,6 +16176,7 @@
                 <w:szCs w:val="26"/>
               </w:rPr>
             </w:pPr>
+            <w:r/>
           </w:p>
         </w:tc>
         <w:tc>
@@ -16009,6 +16198,7 @@
                 <w:szCs w:val="26"/>
               </w:rPr>
             </w:pPr>
+            <w:r/>
           </w:p>
         </w:tc>
         <w:tc>
@@ -16030,6 +16220,7 @@
                 <w:szCs w:val="26"/>
               </w:rPr>
             </w:pPr>
+            <w:r/>
           </w:p>
         </w:tc>
         <w:tc>
@@ -16051,6 +16242,7 @@
                 <w:szCs w:val="26"/>
               </w:rPr>
             </w:pPr>
+            <w:r/>
           </w:p>
         </w:tc>
       </w:tr>
@@ -16128,6 +16320,7 @@
                 <w:szCs w:val="26"/>
               </w:rPr>
             </w:pPr>
+            <w:r/>
           </w:p>
         </w:tc>
         <w:tc>
@@ -16149,6 +16342,7 @@
                 <w:szCs w:val="26"/>
               </w:rPr>
             </w:pPr>
+            <w:r/>
           </w:p>
         </w:tc>
         <w:tc>
@@ -16170,6 +16364,7 @@
                 <w:szCs w:val="26"/>
               </w:rPr>
             </w:pPr>
+            <w:r/>
           </w:p>
         </w:tc>
         <w:tc>
@@ -16191,6 +16386,7 @@
                 <w:szCs w:val="26"/>
               </w:rPr>
             </w:pPr>
+            <w:r/>
           </w:p>
         </w:tc>
         <w:tc>
@@ -16212,6 +16408,7 @@
                 <w:szCs w:val="26"/>
               </w:rPr>
             </w:pPr>
+            <w:r/>
           </w:p>
         </w:tc>
       </w:tr>
@@ -16289,6 +16486,7 @@
                 <w:szCs w:val="26"/>
               </w:rPr>
             </w:pPr>
+            <w:r/>
           </w:p>
         </w:tc>
         <w:tc>
@@ -16310,6 +16508,9 @@
                 <w:szCs w:val="26"/>
               </w:rPr>
             </w:pPr>
+            <w:r>
+              <w:t>Tin học</w:t>
+            </w:r>
           </w:p>
         </w:tc>
         <w:tc>
@@ -16331,6 +16532,9 @@
                 <w:szCs w:val="26"/>
               </w:rPr>
             </w:pPr>
+            <w:r>
+              <w:t>2C1</w:t>
+            </w:r>
           </w:p>
         </w:tc>
         <w:tc>
@@ -16352,6 +16556,7 @@
                 <w:szCs w:val="26"/>
               </w:rPr>
             </w:pPr>
+            <w:r/>
           </w:p>
         </w:tc>
         <w:tc>
@@ -16373,6 +16578,9 @@
                 <w:szCs w:val="26"/>
               </w:rPr>
             </w:pPr>
+            <w:r>
+              <w:t>Phòng Tin học</w:t>
+            </w:r>
           </w:p>
         </w:tc>
       </w:tr>
@@ -16450,6 +16658,7 @@
                 <w:szCs w:val="26"/>
               </w:rPr>
             </w:pPr>
+            <w:r/>
           </w:p>
         </w:tc>
         <w:tc>
@@ -16471,6 +16680,7 @@
                 <w:szCs w:val="26"/>
               </w:rPr>
             </w:pPr>
+            <w:r/>
           </w:p>
         </w:tc>
         <w:tc>
@@ -16492,6 +16702,7 @@
                 <w:szCs w:val="26"/>
               </w:rPr>
             </w:pPr>
+            <w:r/>
           </w:p>
         </w:tc>
         <w:tc>
@@ -16513,6 +16724,7 @@
                 <w:szCs w:val="26"/>
               </w:rPr>
             </w:pPr>
+            <w:r/>
           </w:p>
         </w:tc>
         <w:tc>
@@ -16534,6 +16746,7 @@
                 <w:szCs w:val="26"/>
               </w:rPr>
             </w:pPr>
+            <w:r/>
           </w:p>
         </w:tc>
       </w:tr>
@@ -16611,6 +16824,7 @@
                 <w:szCs w:val="26"/>
               </w:rPr>
             </w:pPr>
+            <w:r/>
           </w:p>
         </w:tc>
         <w:tc>
@@ -16632,6 +16846,7 @@
                 <w:szCs w:val="26"/>
               </w:rPr>
             </w:pPr>
+            <w:r/>
           </w:p>
         </w:tc>
         <w:tc>
@@ -16653,6 +16868,7 @@
                 <w:szCs w:val="26"/>
               </w:rPr>
             </w:pPr>
+            <w:r/>
           </w:p>
         </w:tc>
         <w:tc>
@@ -16674,6 +16890,7 @@
                 <w:szCs w:val="26"/>
               </w:rPr>
             </w:pPr>
+            <w:r/>
           </w:p>
         </w:tc>
         <w:tc>
@@ -16695,6 +16912,7 @@
                 <w:szCs w:val="26"/>
               </w:rPr>
             </w:pPr>
+            <w:r/>
           </w:p>
         </w:tc>
       </w:tr>
@@ -16784,7 +17002,6 @@
                 <w:sz w:val="26"/>
                 <w:szCs w:val="26"/>
               </w:rPr>
-              <w:t>1</w:t>
             </w:r>
           </w:p>
         </w:tc>
@@ -16871,7 +17088,6 @@
                 <w:sz w:val="26"/>
                 <w:szCs w:val="26"/>
               </w:rPr>
-              <w:t>Em trở thành nhà sáng tạo số</w:t>
             </w:r>
           </w:p>
         </w:tc>
@@ -16987,7 +17203,6 @@
                 <w:sz w:val="26"/>
                 <w:szCs w:val="26"/>
               </w:rPr>
-              <w:t>1</w:t>
             </w:r>
           </w:p>
         </w:tc>
@@ -17016,7 +17231,6 @@
                 <w:sz w:val="26"/>
                 <w:szCs w:val="26"/>
               </w:rPr>
-              <w:t>Tin học</w:t>
             </w:r>
           </w:p>
         </w:tc>
@@ -17045,7 +17259,6 @@
                 <w:sz w:val="26"/>
                 <w:szCs w:val="26"/>
               </w:rPr>
-              <w:t>1C1</w:t>
             </w:r>
           </w:p>
         </w:tc>
@@ -17074,7 +17287,6 @@
                 <w:sz w:val="26"/>
                 <w:szCs w:val="26"/>
               </w:rPr>
-              <w:t>Em làm quen với thế giới công nghệ</w:t>
             </w:r>
           </w:p>
         </w:tc>
@@ -17103,7 +17315,6 @@
                 <w:sz w:val="26"/>
                 <w:szCs w:val="26"/>
               </w:rPr>
-              <w:t>Phòng Tin học</w:t>
             </w:r>
           </w:p>
         </w:tc>
@@ -17190,7 +17401,6 @@
                 <w:sz w:val="26"/>
                 <w:szCs w:val="26"/>
               </w:rPr>
-              <w:t>1</w:t>
             </w:r>
           </w:p>
         </w:tc>
@@ -17277,7 +17487,6 @@
                 <w:sz w:val="26"/>
                 <w:szCs w:val="26"/>
               </w:rPr>
-              <w:t>Bài 1. Thiết bị vào - ra</w:t>
             </w:r>
           </w:p>
         </w:tc>
@@ -17306,7 +17515,7 @@
                 <w:sz w:val="26"/>
                 <w:szCs w:val="26"/>
               </w:rPr>
-              <w:t>Bộ Kit Robotics</w:t>
+              <w:t>Phòng Tin học</w:t>
             </w:r>
           </w:p>
         </w:tc>
@@ -17393,7 +17602,6 @@
                 <w:sz w:val="26"/>
                 <w:szCs w:val="26"/>
               </w:rPr>
-              <w:t>2</w:t>
             </w:r>
           </w:p>
         </w:tc>
@@ -17480,7 +17688,6 @@
                 <w:sz w:val="26"/>
                 <w:szCs w:val="26"/>
               </w:rPr>
-              <w:t>Bài 2. Phần mềm máy tính</w:t>
             </w:r>
           </w:p>
         </w:tc>
@@ -17590,6 +17797,7 @@
                 <w:szCs w:val="26"/>
               </w:rPr>
             </w:pPr>
+            <w:r/>
           </w:p>
         </w:tc>
         <w:tc>
@@ -17611,6 +17819,7 @@
                 <w:szCs w:val="26"/>
               </w:rPr>
             </w:pPr>
+            <w:r/>
           </w:p>
         </w:tc>
         <w:tc>
@@ -17632,6 +17841,7 @@
                 <w:szCs w:val="26"/>
               </w:rPr>
             </w:pPr>
+            <w:r/>
           </w:p>
         </w:tc>
         <w:tc>
@@ -17653,6 +17863,7 @@
                 <w:szCs w:val="26"/>
               </w:rPr>
             </w:pPr>
+            <w:r/>
           </w:p>
         </w:tc>
         <w:tc>
@@ -17674,6 +17885,7 @@
                 <w:szCs w:val="26"/>
               </w:rPr>
             </w:pPr>
+            <w:r/>
           </w:p>
         </w:tc>
       </w:tr>
@@ -17757,6 +17969,7 @@
                 <w:szCs w:val="26"/>
               </w:rPr>
             </w:pPr>
+            <w:r/>
           </w:p>
         </w:tc>
         <w:tc>
@@ -17778,6 +17991,7 @@
                 <w:szCs w:val="26"/>
               </w:rPr>
             </w:pPr>
+            <w:r/>
           </w:p>
         </w:tc>
         <w:tc>
@@ -17799,6 +18013,7 @@
                 <w:szCs w:val="26"/>
               </w:rPr>
             </w:pPr>
+            <w:r/>
           </w:p>
         </w:tc>
         <w:tc>
@@ -17820,6 +18035,7 @@
                 <w:szCs w:val="26"/>
               </w:rPr>
             </w:pPr>
+            <w:r/>
           </w:p>
         </w:tc>
         <w:tc>
@@ -17841,6 +18057,7 @@
                 <w:szCs w:val="26"/>
               </w:rPr>
             </w:pPr>
+            <w:r/>
           </w:p>
         </w:tc>
       </w:tr>
@@ -17920,6 +18137,7 @@
                 <w:szCs w:val="26"/>
               </w:rPr>
             </w:pPr>
+            <w:r/>
           </w:p>
         </w:tc>
         <w:tc>
@@ -17941,6 +18159,7 @@
                 <w:szCs w:val="26"/>
               </w:rPr>
             </w:pPr>
+            <w:r/>
           </w:p>
         </w:tc>
         <w:tc>
@@ -17962,6 +18181,7 @@
                 <w:szCs w:val="26"/>
               </w:rPr>
             </w:pPr>
+            <w:r/>
           </w:p>
         </w:tc>
         <w:tc>
@@ -17983,6 +18203,7 @@
                 <w:szCs w:val="26"/>
               </w:rPr>
             </w:pPr>
+            <w:r/>
           </w:p>
         </w:tc>
         <w:tc>
@@ -18004,6 +18225,7 @@
                 <w:szCs w:val="26"/>
               </w:rPr>
             </w:pPr>
+            <w:r/>
           </w:p>
         </w:tc>
       </w:tr>
@@ -18089,7 +18311,6 @@
                 <w:sz w:val="26"/>
                 <w:szCs w:val="26"/>
               </w:rPr>
-              <w:t>1</w:t>
             </w:r>
           </w:p>
         </w:tc>
@@ -18176,7 +18397,6 @@
                 <w:sz w:val="26"/>
                 <w:szCs w:val="26"/>
               </w:rPr>
-              <w:t>Bài 1: Phần cứng và phần mềm máy tính</w:t>
             </w:r>
           </w:p>
         </w:tc>
@@ -18292,7 +18512,6 @@
                 <w:sz w:val="26"/>
                 <w:szCs w:val="26"/>
               </w:rPr>
-              <w:t>1</w:t>
             </w:r>
           </w:p>
         </w:tc>
@@ -18379,7 +18598,6 @@
                 <w:sz w:val="26"/>
                 <w:szCs w:val="26"/>
               </w:rPr>
-              <w:t>Bài 1. Hãy nấu những món ăn ngon</w:t>
             </w:r>
           </w:p>
         </w:tc>
@@ -18489,6 +18707,7 @@
                 <w:szCs w:val="26"/>
               </w:rPr>
             </w:pPr>
+            <w:r/>
           </w:p>
         </w:tc>
         <w:tc>
@@ -18510,6 +18729,7 @@
                 <w:szCs w:val="26"/>
               </w:rPr>
             </w:pPr>
+            <w:r/>
           </w:p>
         </w:tc>
         <w:tc>
@@ -18531,6 +18751,7 @@
                 <w:szCs w:val="26"/>
               </w:rPr>
             </w:pPr>
+            <w:r/>
           </w:p>
         </w:tc>
         <w:tc>
@@ -18552,6 +18773,7 @@
                 <w:szCs w:val="26"/>
               </w:rPr>
             </w:pPr>
+            <w:r/>
           </w:p>
         </w:tc>
         <w:tc>
@@ -18573,6 +18795,7 @@
                 <w:szCs w:val="26"/>
               </w:rPr>
             </w:pPr>
+            <w:r/>
           </w:p>
         </w:tc>
       </w:tr>
@@ -18662,7 +18885,6 @@
                 <w:sz w:val="26"/>
                 <w:szCs w:val="26"/>
               </w:rPr>
-              <w:t>1</w:t>
             </w:r>
           </w:p>
         </w:tc>
@@ -18749,7 +18971,6 @@
                 <w:sz w:val="26"/>
                 <w:szCs w:val="26"/>
               </w:rPr>
-              <w:t>Bài 1: Thông tin và quyết định</w:t>
             </w:r>
           </w:p>
         </w:tc>
@@ -18865,7 +19086,6 @@
                 <w:sz w:val="26"/>
                 <w:szCs w:val="26"/>
               </w:rPr>
-              <w:t>1</w:t>
             </w:r>
           </w:p>
         </w:tc>
@@ -18952,7 +19172,6 @@
                 <w:sz w:val="26"/>
                 <w:szCs w:val="26"/>
               </w:rPr>
-              <w:t>Em làm quen với thế giới công nghệ</w:t>
             </w:r>
           </w:p>
         </w:tc>
@@ -19068,7 +19287,6 @@
                 <w:sz w:val="26"/>
                 <w:szCs w:val="26"/>
               </w:rPr>
-              <w:t>1</w:t>
             </w:r>
           </w:p>
         </w:tc>
@@ -19155,7 +19373,6 @@
                 <w:sz w:val="26"/>
                 <w:szCs w:val="26"/>
               </w:rPr>
-              <w:t>Em làm quen với thế giới công nghệ</w:t>
             </w:r>
           </w:p>
         </w:tc>
@@ -19271,7 +19488,6 @@
                 <w:sz w:val="26"/>
                 <w:szCs w:val="26"/>
               </w:rPr>
-              <w:t>1</w:t>
             </w:r>
           </w:p>
         </w:tc>
@@ -19358,7 +19574,6 @@
                 <w:sz w:val="26"/>
                 <w:szCs w:val="26"/>
               </w:rPr>
-              <w:t>Bài 1. Tập thể dục nào!</w:t>
             </w:r>
           </w:p>
         </w:tc>
@@ -19468,6 +19683,7 @@
                 <w:szCs w:val="26"/>
               </w:rPr>
             </w:pPr>
+            <w:r/>
           </w:p>
         </w:tc>
         <w:tc>
@@ -19489,6 +19705,7 @@
                 <w:szCs w:val="26"/>
               </w:rPr>
             </w:pPr>
+            <w:r/>
           </w:p>
         </w:tc>
         <w:tc>
@@ -19510,6 +19727,7 @@
                 <w:szCs w:val="26"/>
               </w:rPr>
             </w:pPr>
+            <w:r/>
           </w:p>
         </w:tc>
         <w:tc>
@@ -19531,6 +19749,7 @@
                 <w:szCs w:val="26"/>
               </w:rPr>
             </w:pPr>
+            <w:r/>
           </w:p>
         </w:tc>
         <w:tc>
@@ -19552,6 +19771,7 @@
                 <w:szCs w:val="26"/>
               </w:rPr>
             </w:pPr>
+            <w:r/>
           </w:p>
         </w:tc>
       </w:tr>
@@ -19641,7 +19861,6 @@
                 <w:sz w:val="26"/>
                 <w:szCs w:val="26"/>
               </w:rPr>
-              <w:t>1</w:t>
             </w:r>
           </w:p>
         </w:tc>
@@ -19728,7 +19947,6 @@
                 <w:sz w:val="26"/>
                 <w:szCs w:val="26"/>
               </w:rPr>
-              <w:t>Bài 1. Lược sử công cụ tính toán</w:t>
             </w:r>
           </w:p>
         </w:tc>
@@ -19757,7 +19975,7 @@
                 <w:sz w:val="26"/>
                 <w:szCs w:val="26"/>
               </w:rPr>
-              <w:t>Bộ Kit Robotics</w:t>
+              <w:t>Phòng Tin học</w:t>
             </w:r>
           </w:p>
         </w:tc>
@@ -19841,7 +20059,6 @@
                 <w:sz w:val="26"/>
                 <w:szCs w:val="26"/>
               </w:rPr>
-              <w:t>2</w:t>
             </w:r>
           </w:p>
         </w:tc>
@@ -19928,7 +20145,6 @@
                 <w:sz w:val="26"/>
                 <w:szCs w:val="26"/>
               </w:rPr>
-              <w:t>Bài 2. Thông tin trong môi trường số</w:t>
             </w:r>
           </w:p>
         </w:tc>
@@ -20041,7 +20257,6 @@
                 <w:sz w:val="26"/>
                 <w:szCs w:val="26"/>
               </w:rPr>
-              <w:t>1</w:t>
             </w:r>
           </w:p>
         </w:tc>
@@ -20128,7 +20343,6 @@
                 <w:sz w:val="26"/>
                 <w:szCs w:val="26"/>
               </w:rPr>
-              <w:t>Bài 1. Hãy nấu những món ăn ngon</w:t>
             </w:r>
           </w:p>
         </w:tc>
@@ -20235,6 +20449,7 @@
                 <w:szCs w:val="26"/>
               </w:rPr>
             </w:pPr>
+            <w:r/>
           </w:p>
         </w:tc>
         <w:tc>
@@ -20256,6 +20471,7 @@
                 <w:szCs w:val="26"/>
               </w:rPr>
             </w:pPr>
+            <w:r/>
           </w:p>
         </w:tc>
         <w:tc>
@@ -20277,6 +20493,7 @@
                 <w:szCs w:val="26"/>
               </w:rPr>
             </w:pPr>
+            <w:r/>
           </w:p>
         </w:tc>
         <w:tc>
@@ -20298,6 +20515,7 @@
                 <w:szCs w:val="26"/>
               </w:rPr>
             </w:pPr>
+            <w:r/>
           </w:p>
         </w:tc>
         <w:tc>
@@ -20319,6 +20537,7 @@
                 <w:szCs w:val="26"/>
               </w:rPr>
             </w:pPr>
+            <w:r/>
           </w:p>
         </w:tc>
       </w:tr>
@@ -20395,6 +20614,7 @@
                 <w:szCs w:val="26"/>
               </w:rPr>
             </w:pPr>
+            <w:r/>
           </w:p>
         </w:tc>
         <w:tc>
@@ -20416,6 +20636,7 @@
                 <w:szCs w:val="26"/>
               </w:rPr>
             </w:pPr>
+            <w:r/>
           </w:p>
         </w:tc>
         <w:tc>
@@ -20437,6 +20658,7 @@
                 <w:szCs w:val="26"/>
               </w:rPr>
             </w:pPr>
+            <w:r/>
           </w:p>
         </w:tc>
         <w:tc>
@@ -20458,6 +20680,7 @@
                 <w:szCs w:val="26"/>
               </w:rPr>
             </w:pPr>
+            <w:r/>
           </w:p>
         </w:tc>
         <w:tc>
@@ -20479,6 +20702,7 @@
                 <w:szCs w:val="26"/>
               </w:rPr>
             </w:pPr>
+            <w:r/>
           </w:p>
         </w:tc>
       </w:tr>

</xml_diff>